<commit_message>
Proposal Section 6: update Table 8 with v4 results, time constraint, reference links
Co-Authored-By: Claude Opus 5.5 <noreply@anthropic.com>
Claude-Session: https://claude.ai/code/session_01Ghe1P8BgNsyGdHuD4xCbdv
</commit_message>
<xml_diff>
--- a/docs/ECE_414_Proposal_Draft_with_Section6.docx
+++ b/docs/ECE_414_Proposal_Draft_with_Section6.docx
@@ -205,25 +205,7 @@
         <w:rPr>
           <w:sz w:val="24"/>
         </w:rPr>
-        <w:t>Project</w:t>
-      </w:r>
-      <w:r>
-        <w:rPr>
-          <w:sz w:val="24"/>
-        </w:rPr>
-        <w:t xml:space="preserve"> Title</w:t>
-      </w:r>
-      <w:r>
-        <w:rPr>
-          <w:sz w:val="24"/>
-        </w:rPr>
-        <w:t xml:space="preserve">: </w:t>
-      </w:r>
-      <w:r>
-        <w:rPr>
-          <w:sz w:val="24"/>
-        </w:rPr>
-        <w:t>Multilingual Sign-to-Speech Communication Device: Edge-Deployed ASL Recognition with Confidence-Gated Speech Output</w:t>
+        <w:t xml:space="preserve">Project Title: Multilingual Sign-to-Speech Communication Device: Edge-Deployed ASL Recognition with Confidence-Gated Speech Output</w:t>
       </w:r>
     </w:p>
     <w:p>
@@ -251,22 +233,9 @@
         <w:jc w:val="center"/>
       </w:pPr>
       <w:r>
-        <w:t xml:space="preserve">Name(s): </w:t>
-      </w:r>
-      <w:r>
-        <w:t>Zeynep Hafsa Cakici</w:t>
-      </w:r>
-      <w:r>
-        <w:t xml:space="preserve"> </w:t>
-      </w:r>
-      <w:r>
+        <w:t xml:space="preserve">Name(s): Zeynep Hafsa Cakici </w:t>
         <w:tab/>
-      </w:r>
-      <w:r>
-        <w:t xml:space="preserve">ID# </w:t>
-      </w:r>
-      <w:r>
-        <w:t>31699521</w:t>
+        <w:t xml:space="preserve">ID# 31699521</w:t>
       </w:r>
     </w:p>
     <w:p>
@@ -276,25 +245,10 @@
         <w:jc w:val="center"/>
       </w:pPr>
       <w:r>
-        <w:t xml:space="preserve">Name(s): </w:t>
-      </w:r>
-      <w:r>
-        <w:t>Dorukhan Cakir</w:t>
-      </w:r>
-      <w:r>
-        <w:t xml:space="preserve"> </w:t>
-      </w:r>
-      <w:r>
+        <w:t xml:space="preserve">Name(s): Dorukhan Cakir </w:t>
         <w:tab/>
-      </w:r>
-      <w:r>
         <w:tab/>
-      </w:r>
-      <w:r>
-        <w:t xml:space="preserve">ID# </w:t>
-      </w:r>
-      <w:r>
-        <w:t>31699799</w:t>
+        <w:t xml:space="preserve">ID# 31699799</w:t>
       </w:r>
     </w:p>
     <w:p>
@@ -304,22 +258,10 @@
         <w:jc w:val="center"/>
       </w:pPr>
       <w:r>
-        <w:t xml:space="preserve">Name(s): </w:t>
-      </w:r>
-      <w:r>
-        <w:t>Merrick Simmons</w:t>
-      </w:r>
-      <w:r>
+        <w:t xml:space="preserve">Name(s): Merrick Simmons</w:t>
         <w:tab/>
-      </w:r>
-      <w:r>
         <w:tab/>
-      </w:r>
-      <w:r>
-        <w:t xml:space="preserve">ID# </w:t>
-      </w:r>
-      <w:r>
-        <w:t>31623224</w:t>
+        <w:t xml:space="preserve">ID# 31623224</w:t>
       </w:r>
     </w:p>
     <w:p>
@@ -330,15 +272,9 @@
       </w:pPr>
       <w:r>
         <w:t>Name(s): Asmar Hasanova</w:t>
-      </w:r>
-      <w:r>
         <w:tab/>
-      </w:r>
-      <w:r>
         <w:tab/>
         <w:t>ID# 31699507</w:t>
-      </w:r>
-      <w:r>
         <w:br w:type="page"/>
       </w:r>
     </w:p>
@@ -358,13 +294,7 @@
           <w:b/>
         </w:rPr>
         <w:lastRenderedPageBreak/>
-        <w:t>Abstract</w:t>
-      </w:r>
-      <w:r>
-        <w:rPr>
-          <w:b/>
-        </w:rPr>
-        <w:t xml:space="preserve"> </w:t>
+        <w:t xml:space="preserve">Abstract </w:t>
       </w:r>
     </w:p>
     <w:p>
@@ -677,11 +607,7 @@
       </w:pPr>
       <w:r>
         <w:fldChar w:fldCharType="begin"/>
-      </w:r>
-      <w:r>
         <w:instrText xml:space="preserve"> TOC \h \z \t "Intro Section,1,Intro Subsection,2" </w:instrText>
-      </w:r>
-      <w:r>
         <w:fldChar w:fldCharType="separate"/>
       </w:r>
       <w:hyperlink w:anchor="_Toc242907031" w:history="1">
@@ -698,46 +624,10 @@
             <w:webHidden/>
           </w:rPr>
           <w:tab/>
-        </w:r>
-        <w:r>
-          <w:rPr>
-            <w:noProof/>
-            <w:webHidden/>
-          </w:rPr>
           <w:fldChar w:fldCharType="begin"/>
-        </w:r>
-        <w:r>
-          <w:rPr>
-            <w:noProof/>
-            <w:webHidden/>
-          </w:rPr>
           <w:instrText xml:space="preserve"> PAGEREF _Toc242907031 \h </w:instrText>
-        </w:r>
-        <w:r>
-          <w:rPr>
-            <w:noProof/>
-            <w:webHidden/>
-          </w:rPr>
-        </w:r>
-        <w:r>
-          <w:rPr>
-            <w:noProof/>
-            <w:webHidden/>
-          </w:rPr>
           <w:fldChar w:fldCharType="separate"/>
-        </w:r>
-        <w:r>
-          <w:rPr>
-            <w:noProof/>
-            <w:webHidden/>
-          </w:rPr>
           <w:t>3</w:t>
-        </w:r>
-        <w:r>
-          <w:rPr>
-            <w:noProof/>
-            <w:webHidden/>
-          </w:rPr>
           <w:fldChar w:fldCharType="end"/>
         </w:r>
       </w:hyperlink>
@@ -771,46 +661,10 @@
             <w:webHidden/>
           </w:rPr>
           <w:tab/>
-        </w:r>
-        <w:r>
-          <w:rPr>
-            <w:noProof/>
-            <w:webHidden/>
-          </w:rPr>
           <w:fldChar w:fldCharType="begin"/>
-        </w:r>
-        <w:r>
-          <w:rPr>
-            <w:noProof/>
-            <w:webHidden/>
-          </w:rPr>
           <w:instrText xml:space="preserve"> PAGEREF _Toc242907032 \h </w:instrText>
-        </w:r>
-        <w:r>
-          <w:rPr>
-            <w:noProof/>
-            <w:webHidden/>
-          </w:rPr>
-        </w:r>
-        <w:r>
-          <w:rPr>
-            <w:noProof/>
-            <w:webHidden/>
-          </w:rPr>
           <w:fldChar w:fldCharType="separate"/>
-        </w:r>
-        <w:r>
-          <w:rPr>
-            <w:noProof/>
-            <w:webHidden/>
-          </w:rPr>
           <w:t>3</w:t>
-        </w:r>
-        <w:r>
-          <w:rPr>
-            <w:noProof/>
-            <w:webHidden/>
-          </w:rPr>
           <w:fldChar w:fldCharType="end"/>
         </w:r>
       </w:hyperlink>
@@ -844,46 +698,10 @@
             <w:webHidden/>
           </w:rPr>
           <w:tab/>
-        </w:r>
-        <w:r>
-          <w:rPr>
-            <w:noProof/>
-            <w:webHidden/>
-          </w:rPr>
           <w:fldChar w:fldCharType="begin"/>
-        </w:r>
-        <w:r>
-          <w:rPr>
-            <w:noProof/>
-            <w:webHidden/>
-          </w:rPr>
           <w:instrText xml:space="preserve"> PAGEREF _Toc242907033 \h </w:instrText>
-        </w:r>
-        <w:r>
-          <w:rPr>
-            <w:noProof/>
-            <w:webHidden/>
-          </w:rPr>
-        </w:r>
-        <w:r>
-          <w:rPr>
-            <w:noProof/>
-            <w:webHidden/>
-          </w:rPr>
           <w:fldChar w:fldCharType="separate"/>
-        </w:r>
-        <w:r>
-          <w:rPr>
-            <w:noProof/>
-            <w:webHidden/>
-          </w:rPr>
           <w:t>4</w:t>
-        </w:r>
-        <w:r>
-          <w:rPr>
-            <w:noProof/>
-            <w:webHidden/>
-          </w:rPr>
           <w:fldChar w:fldCharType="end"/>
         </w:r>
       </w:hyperlink>
@@ -917,46 +735,10 @@
             <w:webHidden/>
           </w:rPr>
           <w:tab/>
-        </w:r>
-        <w:r>
-          <w:rPr>
-            <w:noProof/>
-            <w:webHidden/>
-          </w:rPr>
           <w:fldChar w:fldCharType="begin"/>
-        </w:r>
-        <w:r>
-          <w:rPr>
-            <w:noProof/>
-            <w:webHidden/>
-          </w:rPr>
           <w:instrText xml:space="preserve"> PAGEREF _Toc242907034 \h </w:instrText>
-        </w:r>
-        <w:r>
-          <w:rPr>
-            <w:noProof/>
-            <w:webHidden/>
-          </w:rPr>
-        </w:r>
-        <w:r>
-          <w:rPr>
-            <w:noProof/>
-            <w:webHidden/>
-          </w:rPr>
           <w:fldChar w:fldCharType="separate"/>
-        </w:r>
-        <w:r>
-          <w:rPr>
-            <w:noProof/>
-            <w:webHidden/>
-          </w:rPr>
           <w:t>4</w:t>
-        </w:r>
-        <w:r>
-          <w:rPr>
-            <w:noProof/>
-            <w:webHidden/>
-          </w:rPr>
           <w:fldChar w:fldCharType="end"/>
         </w:r>
       </w:hyperlink>
@@ -990,46 +772,10 @@
             <w:webHidden/>
           </w:rPr>
           <w:tab/>
-        </w:r>
-        <w:r>
-          <w:rPr>
-            <w:noProof/>
-            <w:webHidden/>
-          </w:rPr>
           <w:fldChar w:fldCharType="begin"/>
-        </w:r>
-        <w:r>
-          <w:rPr>
-            <w:noProof/>
-            <w:webHidden/>
-          </w:rPr>
           <w:instrText xml:space="preserve"> PAGEREF _Toc242907035 \h </w:instrText>
-        </w:r>
-        <w:r>
-          <w:rPr>
-            <w:noProof/>
-            <w:webHidden/>
-          </w:rPr>
-        </w:r>
-        <w:r>
-          <w:rPr>
-            <w:noProof/>
-            <w:webHidden/>
-          </w:rPr>
           <w:fldChar w:fldCharType="separate"/>
-        </w:r>
-        <w:r>
-          <w:rPr>
-            <w:noProof/>
-            <w:webHidden/>
-          </w:rPr>
           <w:t>6</w:t>
-        </w:r>
-        <w:r>
-          <w:rPr>
-            <w:noProof/>
-            <w:webHidden/>
-          </w:rPr>
           <w:fldChar w:fldCharType="end"/>
         </w:r>
       </w:hyperlink>
@@ -1063,46 +809,10 @@
             <w:webHidden/>
           </w:rPr>
           <w:tab/>
-        </w:r>
-        <w:r>
-          <w:rPr>
-            <w:noProof/>
-            <w:webHidden/>
-          </w:rPr>
           <w:fldChar w:fldCharType="begin"/>
-        </w:r>
-        <w:r>
-          <w:rPr>
-            <w:noProof/>
-            <w:webHidden/>
-          </w:rPr>
           <w:instrText xml:space="preserve"> PAGEREF _Toc242907036 \h </w:instrText>
-        </w:r>
-        <w:r>
-          <w:rPr>
-            <w:noProof/>
-            <w:webHidden/>
-          </w:rPr>
-        </w:r>
-        <w:r>
-          <w:rPr>
-            <w:noProof/>
-            <w:webHidden/>
-          </w:rPr>
           <w:fldChar w:fldCharType="separate"/>
-        </w:r>
-        <w:r>
-          <w:rPr>
-            <w:noProof/>
-            <w:webHidden/>
-          </w:rPr>
           <w:t>8</w:t>
-        </w:r>
-        <w:r>
-          <w:rPr>
-            <w:noProof/>
-            <w:webHidden/>
-          </w:rPr>
           <w:fldChar w:fldCharType="end"/>
         </w:r>
       </w:hyperlink>
@@ -1136,46 +846,10 @@
             <w:webHidden/>
           </w:rPr>
           <w:tab/>
-        </w:r>
-        <w:r>
-          <w:rPr>
-            <w:noProof/>
-            <w:webHidden/>
-          </w:rPr>
           <w:fldChar w:fldCharType="begin"/>
-        </w:r>
-        <w:r>
-          <w:rPr>
-            <w:noProof/>
-            <w:webHidden/>
-          </w:rPr>
           <w:instrText xml:space="preserve"> PAGEREF _Toc242907037 \h </w:instrText>
-        </w:r>
-        <w:r>
-          <w:rPr>
-            <w:noProof/>
-            <w:webHidden/>
-          </w:rPr>
-        </w:r>
-        <w:r>
-          <w:rPr>
-            <w:noProof/>
-            <w:webHidden/>
-          </w:rPr>
           <w:fldChar w:fldCharType="separate"/>
-        </w:r>
-        <w:r>
-          <w:rPr>
-            <w:noProof/>
-            <w:webHidden/>
-          </w:rPr>
           <w:t>8</w:t>
-        </w:r>
-        <w:r>
-          <w:rPr>
-            <w:noProof/>
-            <w:webHidden/>
-          </w:rPr>
           <w:fldChar w:fldCharType="end"/>
         </w:r>
       </w:hyperlink>
@@ -1209,46 +883,10 @@
             <w:webHidden/>
           </w:rPr>
           <w:tab/>
-        </w:r>
-        <w:r>
-          <w:rPr>
-            <w:noProof/>
-            <w:webHidden/>
-          </w:rPr>
           <w:fldChar w:fldCharType="begin"/>
-        </w:r>
-        <w:r>
-          <w:rPr>
-            <w:noProof/>
-            <w:webHidden/>
-          </w:rPr>
           <w:instrText xml:space="preserve"> PAGEREF _Toc242907038 \h </w:instrText>
-        </w:r>
-        <w:r>
-          <w:rPr>
-            <w:noProof/>
-            <w:webHidden/>
-          </w:rPr>
-        </w:r>
-        <w:r>
-          <w:rPr>
-            <w:noProof/>
-            <w:webHidden/>
-          </w:rPr>
           <w:fldChar w:fldCharType="separate"/>
-        </w:r>
-        <w:r>
-          <w:rPr>
-            <w:noProof/>
-            <w:webHidden/>
-          </w:rPr>
           <w:t>9</w:t>
-        </w:r>
-        <w:r>
-          <w:rPr>
-            <w:noProof/>
-            <w:webHidden/>
-          </w:rPr>
           <w:fldChar w:fldCharType="end"/>
         </w:r>
       </w:hyperlink>
@@ -1282,46 +920,10 @@
             <w:webHidden/>
           </w:rPr>
           <w:tab/>
-        </w:r>
-        <w:r>
-          <w:rPr>
-            <w:noProof/>
-            <w:webHidden/>
-          </w:rPr>
           <w:fldChar w:fldCharType="begin"/>
-        </w:r>
-        <w:r>
-          <w:rPr>
-            <w:noProof/>
-            <w:webHidden/>
-          </w:rPr>
           <w:instrText xml:space="preserve"> PAGEREF _Toc242907039 \h </w:instrText>
-        </w:r>
-        <w:r>
-          <w:rPr>
-            <w:noProof/>
-            <w:webHidden/>
-          </w:rPr>
-        </w:r>
-        <w:r>
-          <w:rPr>
-            <w:noProof/>
-            <w:webHidden/>
-          </w:rPr>
           <w:fldChar w:fldCharType="separate"/>
-        </w:r>
-        <w:r>
-          <w:rPr>
-            <w:noProof/>
-            <w:webHidden/>
-          </w:rPr>
           <w:t>10</w:t>
-        </w:r>
-        <w:r>
-          <w:rPr>
-            <w:noProof/>
-            <w:webHidden/>
-          </w:rPr>
           <w:fldChar w:fldCharType="end"/>
         </w:r>
       </w:hyperlink>
@@ -1355,46 +957,10 @@
             <w:webHidden/>
           </w:rPr>
           <w:tab/>
-        </w:r>
-        <w:r>
-          <w:rPr>
-            <w:noProof/>
-            <w:webHidden/>
-          </w:rPr>
           <w:fldChar w:fldCharType="begin"/>
-        </w:r>
-        <w:r>
-          <w:rPr>
-            <w:noProof/>
-            <w:webHidden/>
-          </w:rPr>
           <w:instrText xml:space="preserve"> PAGEREF _Toc242907040 \h </w:instrText>
-        </w:r>
-        <w:r>
-          <w:rPr>
-            <w:noProof/>
-            <w:webHidden/>
-          </w:rPr>
-        </w:r>
-        <w:r>
-          <w:rPr>
-            <w:noProof/>
-            <w:webHidden/>
-          </w:rPr>
           <w:fldChar w:fldCharType="separate"/>
-        </w:r>
-        <w:r>
-          <w:rPr>
-            <w:noProof/>
-            <w:webHidden/>
-          </w:rPr>
           <w:t>11</w:t>
-        </w:r>
-        <w:r>
-          <w:rPr>
-            <w:noProof/>
-            <w:webHidden/>
-          </w:rPr>
           <w:fldChar w:fldCharType="end"/>
         </w:r>
       </w:hyperlink>
@@ -1428,46 +994,10 @@
             <w:webHidden/>
           </w:rPr>
           <w:tab/>
-        </w:r>
-        <w:r>
-          <w:rPr>
-            <w:noProof/>
-            <w:webHidden/>
-          </w:rPr>
           <w:fldChar w:fldCharType="begin"/>
-        </w:r>
-        <w:r>
-          <w:rPr>
-            <w:noProof/>
-            <w:webHidden/>
-          </w:rPr>
           <w:instrText xml:space="preserve"> PAGEREF _Toc242907041 \h </w:instrText>
-        </w:r>
-        <w:r>
-          <w:rPr>
-            <w:noProof/>
-            <w:webHidden/>
-          </w:rPr>
-        </w:r>
-        <w:r>
-          <w:rPr>
-            <w:noProof/>
-            <w:webHidden/>
-          </w:rPr>
           <w:fldChar w:fldCharType="separate"/>
-        </w:r>
-        <w:r>
-          <w:rPr>
-            <w:noProof/>
-            <w:webHidden/>
-          </w:rPr>
           <w:t>12</w:t>
-        </w:r>
-        <w:r>
-          <w:rPr>
-            <w:noProof/>
-            <w:webHidden/>
-          </w:rPr>
           <w:fldChar w:fldCharType="end"/>
         </w:r>
       </w:hyperlink>
@@ -1501,46 +1031,10 @@
             <w:webHidden/>
           </w:rPr>
           <w:tab/>
-        </w:r>
-        <w:r>
-          <w:rPr>
-            <w:noProof/>
-            <w:webHidden/>
-          </w:rPr>
           <w:fldChar w:fldCharType="begin"/>
-        </w:r>
-        <w:r>
-          <w:rPr>
-            <w:noProof/>
-            <w:webHidden/>
-          </w:rPr>
           <w:instrText xml:space="preserve"> PAGEREF _Toc242907042 \h </w:instrText>
-        </w:r>
-        <w:r>
-          <w:rPr>
-            <w:noProof/>
-            <w:webHidden/>
-          </w:rPr>
-        </w:r>
-        <w:r>
-          <w:rPr>
-            <w:noProof/>
-            <w:webHidden/>
-          </w:rPr>
           <w:fldChar w:fldCharType="separate"/>
-        </w:r>
-        <w:r>
-          <w:rPr>
-            <w:noProof/>
-            <w:webHidden/>
-          </w:rPr>
           <w:t>12</w:t>
-        </w:r>
-        <w:r>
-          <w:rPr>
-            <w:noProof/>
-            <w:webHidden/>
-          </w:rPr>
           <w:fldChar w:fldCharType="end"/>
         </w:r>
       </w:hyperlink>
@@ -1574,46 +1068,10 @@
             <w:webHidden/>
           </w:rPr>
           <w:tab/>
-        </w:r>
-        <w:r>
-          <w:rPr>
-            <w:noProof/>
-            <w:webHidden/>
-          </w:rPr>
           <w:fldChar w:fldCharType="begin"/>
-        </w:r>
-        <w:r>
-          <w:rPr>
-            <w:noProof/>
-            <w:webHidden/>
-          </w:rPr>
           <w:instrText xml:space="preserve"> PAGEREF _Toc242907043 \h </w:instrText>
-        </w:r>
-        <w:r>
-          <w:rPr>
-            <w:noProof/>
-            <w:webHidden/>
-          </w:rPr>
-        </w:r>
-        <w:r>
-          <w:rPr>
-            <w:noProof/>
-            <w:webHidden/>
-          </w:rPr>
           <w:fldChar w:fldCharType="separate"/>
-        </w:r>
-        <w:r>
-          <w:rPr>
-            <w:noProof/>
-            <w:webHidden/>
-          </w:rPr>
           <w:t>13</w:t>
-        </w:r>
-        <w:r>
-          <w:rPr>
-            <w:noProof/>
-            <w:webHidden/>
-          </w:rPr>
           <w:fldChar w:fldCharType="end"/>
         </w:r>
       </w:hyperlink>
@@ -1647,46 +1105,10 @@
             <w:webHidden/>
           </w:rPr>
           <w:tab/>
-        </w:r>
-        <w:r>
-          <w:rPr>
-            <w:noProof/>
-            <w:webHidden/>
-          </w:rPr>
           <w:fldChar w:fldCharType="begin"/>
-        </w:r>
-        <w:r>
-          <w:rPr>
-            <w:noProof/>
-            <w:webHidden/>
-          </w:rPr>
           <w:instrText xml:space="preserve"> PAGEREF _Toc242907044 \h </w:instrText>
-        </w:r>
-        <w:r>
-          <w:rPr>
-            <w:noProof/>
-            <w:webHidden/>
-          </w:rPr>
-        </w:r>
-        <w:r>
-          <w:rPr>
-            <w:noProof/>
-            <w:webHidden/>
-          </w:rPr>
           <w:fldChar w:fldCharType="separate"/>
-        </w:r>
-        <w:r>
-          <w:rPr>
-            <w:noProof/>
-            <w:webHidden/>
-          </w:rPr>
           <w:t>14</w:t>
-        </w:r>
-        <w:r>
-          <w:rPr>
-            <w:noProof/>
-            <w:webHidden/>
-          </w:rPr>
           <w:fldChar w:fldCharType="end"/>
         </w:r>
       </w:hyperlink>
@@ -1720,46 +1142,10 @@
             <w:webHidden/>
           </w:rPr>
           <w:tab/>
-        </w:r>
-        <w:r>
-          <w:rPr>
-            <w:noProof/>
-            <w:webHidden/>
-          </w:rPr>
           <w:fldChar w:fldCharType="begin"/>
-        </w:r>
-        <w:r>
-          <w:rPr>
-            <w:noProof/>
-            <w:webHidden/>
-          </w:rPr>
           <w:instrText xml:space="preserve"> PAGEREF _Toc242907045 \h </w:instrText>
-        </w:r>
-        <w:r>
-          <w:rPr>
-            <w:noProof/>
-            <w:webHidden/>
-          </w:rPr>
-        </w:r>
-        <w:r>
-          <w:rPr>
-            <w:noProof/>
-            <w:webHidden/>
-          </w:rPr>
           <w:fldChar w:fldCharType="separate"/>
-        </w:r>
-        <w:r>
-          <w:rPr>
-            <w:noProof/>
-            <w:webHidden/>
-          </w:rPr>
           <w:t>14</w:t>
-        </w:r>
-        <w:r>
-          <w:rPr>
-            <w:noProof/>
-            <w:webHidden/>
-          </w:rPr>
           <w:fldChar w:fldCharType="end"/>
         </w:r>
       </w:hyperlink>
@@ -1793,46 +1179,10 @@
             <w:webHidden/>
           </w:rPr>
           <w:tab/>
-        </w:r>
-        <w:r>
-          <w:rPr>
-            <w:noProof/>
-            <w:webHidden/>
-          </w:rPr>
           <w:fldChar w:fldCharType="begin"/>
-        </w:r>
-        <w:r>
-          <w:rPr>
-            <w:noProof/>
-            <w:webHidden/>
-          </w:rPr>
           <w:instrText xml:space="preserve"> PAGEREF _Toc242907046 \h </w:instrText>
-        </w:r>
-        <w:r>
-          <w:rPr>
-            <w:noProof/>
-            <w:webHidden/>
-          </w:rPr>
-        </w:r>
-        <w:r>
-          <w:rPr>
-            <w:noProof/>
-            <w:webHidden/>
-          </w:rPr>
           <w:fldChar w:fldCharType="separate"/>
-        </w:r>
-        <w:r>
-          <w:rPr>
-            <w:noProof/>
-            <w:webHidden/>
-          </w:rPr>
           <w:t>15</w:t>
-        </w:r>
-        <w:r>
-          <w:rPr>
-            <w:noProof/>
-            <w:webHidden/>
-          </w:rPr>
           <w:fldChar w:fldCharType="end"/>
         </w:r>
       </w:hyperlink>
@@ -1866,46 +1216,10 @@
             <w:webHidden/>
           </w:rPr>
           <w:tab/>
-        </w:r>
-        <w:r>
-          <w:rPr>
-            <w:noProof/>
-            <w:webHidden/>
-          </w:rPr>
           <w:fldChar w:fldCharType="begin"/>
-        </w:r>
-        <w:r>
-          <w:rPr>
-            <w:noProof/>
-            <w:webHidden/>
-          </w:rPr>
           <w:instrText xml:space="preserve"> PAGEREF _Toc242907047 \h </w:instrText>
-        </w:r>
-        <w:r>
-          <w:rPr>
-            <w:noProof/>
-            <w:webHidden/>
-          </w:rPr>
-        </w:r>
-        <w:r>
-          <w:rPr>
-            <w:noProof/>
-            <w:webHidden/>
-          </w:rPr>
           <w:fldChar w:fldCharType="separate"/>
-        </w:r>
-        <w:r>
-          <w:rPr>
-            <w:noProof/>
-            <w:webHidden/>
-          </w:rPr>
           <w:t>16</w:t>
-        </w:r>
-        <w:r>
-          <w:rPr>
-            <w:noProof/>
-            <w:webHidden/>
-          </w:rPr>
           <w:fldChar w:fldCharType="end"/>
         </w:r>
       </w:hyperlink>
@@ -1939,46 +1253,10 @@
             <w:webHidden/>
           </w:rPr>
           <w:tab/>
-        </w:r>
-        <w:r>
-          <w:rPr>
-            <w:noProof/>
-            <w:webHidden/>
-          </w:rPr>
           <w:fldChar w:fldCharType="begin"/>
-        </w:r>
-        <w:r>
-          <w:rPr>
-            <w:noProof/>
-            <w:webHidden/>
-          </w:rPr>
           <w:instrText xml:space="preserve"> PAGEREF _Toc242907048 \h </w:instrText>
-        </w:r>
-        <w:r>
-          <w:rPr>
-            <w:noProof/>
-            <w:webHidden/>
-          </w:rPr>
-        </w:r>
-        <w:r>
-          <w:rPr>
-            <w:noProof/>
-            <w:webHidden/>
-          </w:rPr>
           <w:fldChar w:fldCharType="separate"/>
-        </w:r>
-        <w:r>
-          <w:rPr>
-            <w:noProof/>
-            <w:webHidden/>
-          </w:rPr>
           <w:t>17</w:t>
-        </w:r>
-        <w:r>
-          <w:rPr>
-            <w:noProof/>
-            <w:webHidden/>
-          </w:rPr>
           <w:fldChar w:fldCharType="end"/>
         </w:r>
       </w:hyperlink>
@@ -2012,46 +1290,10 @@
             <w:webHidden/>
           </w:rPr>
           <w:tab/>
-        </w:r>
-        <w:r>
-          <w:rPr>
-            <w:noProof/>
-            <w:webHidden/>
-          </w:rPr>
           <w:fldChar w:fldCharType="begin"/>
-        </w:r>
-        <w:r>
-          <w:rPr>
-            <w:noProof/>
-            <w:webHidden/>
-          </w:rPr>
           <w:instrText xml:space="preserve"> PAGEREF _Toc242907049 \h </w:instrText>
-        </w:r>
-        <w:r>
-          <w:rPr>
-            <w:noProof/>
-            <w:webHidden/>
-          </w:rPr>
-        </w:r>
-        <w:r>
-          <w:rPr>
-            <w:noProof/>
-            <w:webHidden/>
-          </w:rPr>
           <w:fldChar w:fldCharType="separate"/>
-        </w:r>
-        <w:r>
-          <w:rPr>
-            <w:noProof/>
-            <w:webHidden/>
-          </w:rPr>
           <w:t>19</w:t>
-        </w:r>
-        <w:r>
-          <w:rPr>
-            <w:noProof/>
-            <w:webHidden/>
-          </w:rPr>
           <w:fldChar w:fldCharType="end"/>
         </w:r>
       </w:hyperlink>
@@ -2085,46 +1327,10 @@
             <w:webHidden/>
           </w:rPr>
           <w:tab/>
-        </w:r>
-        <w:r>
-          <w:rPr>
-            <w:noProof/>
-            <w:webHidden/>
-          </w:rPr>
           <w:fldChar w:fldCharType="begin"/>
-        </w:r>
-        <w:r>
-          <w:rPr>
-            <w:noProof/>
-            <w:webHidden/>
-          </w:rPr>
           <w:instrText xml:space="preserve"> PAGEREF _Toc242907050 \h </w:instrText>
-        </w:r>
-        <w:r>
-          <w:rPr>
-            <w:noProof/>
-            <w:webHidden/>
-          </w:rPr>
-        </w:r>
-        <w:r>
-          <w:rPr>
-            <w:noProof/>
-            <w:webHidden/>
-          </w:rPr>
           <w:fldChar w:fldCharType="separate"/>
-        </w:r>
-        <w:r>
-          <w:rPr>
-            <w:noProof/>
-            <w:webHidden/>
-          </w:rPr>
           <w:t>21</w:t>
-        </w:r>
-        <w:r>
-          <w:rPr>
-            <w:noProof/>
-            <w:webHidden/>
-          </w:rPr>
           <w:fldChar w:fldCharType="end"/>
         </w:r>
       </w:hyperlink>
@@ -2158,46 +1364,10 @@
             <w:webHidden/>
           </w:rPr>
           <w:tab/>
-        </w:r>
-        <w:r>
-          <w:rPr>
-            <w:noProof/>
-            <w:webHidden/>
-          </w:rPr>
           <w:fldChar w:fldCharType="begin"/>
-        </w:r>
-        <w:r>
-          <w:rPr>
-            <w:noProof/>
-            <w:webHidden/>
-          </w:rPr>
           <w:instrText xml:space="preserve"> PAGEREF _Toc242907051 \h </w:instrText>
-        </w:r>
-        <w:r>
-          <w:rPr>
-            <w:noProof/>
-            <w:webHidden/>
-          </w:rPr>
-        </w:r>
-        <w:r>
-          <w:rPr>
-            <w:noProof/>
-            <w:webHidden/>
-          </w:rPr>
           <w:fldChar w:fldCharType="separate"/>
-        </w:r>
-        <w:r>
-          <w:rPr>
-            <w:noProof/>
-            <w:webHidden/>
-          </w:rPr>
           <w:t>25</w:t>
-        </w:r>
-        <w:r>
-          <w:rPr>
-            <w:noProof/>
-            <w:webHidden/>
-          </w:rPr>
           <w:fldChar w:fldCharType="end"/>
         </w:r>
       </w:hyperlink>
@@ -2339,14 +1509,7 @@
           <w:sz w:val="24"/>
           <w:szCs w:val="24"/>
         </w:rPr>
-        <w:t>Recent research is therefore moving toward gloss-free and self-supervised models. SignDino, for example, learns sign representations from video without any gloss or text labels [4]. Gan et al. similarly learn sign features without text supervision and use them for gloss-free translation [5]. A parallel trend is lightweight models that work on body and hand landmarks rather than on full video frames, which makes them small and fast enough for embedded hardware. MediaPipe is a widely used framework for extrac</w:t>
-      </w:r>
-      <w:r>
-        <w:rPr>
-          <w:sz w:val="24"/>
-          <w:szCs w:val="24"/>
-        </w:rPr>
-        <w:t>ting such landmarks [6]. The winning solution of the Google – Isolated Sign Language Recognition competition on Kaggle, a one-dimensional convolutional neural network (1D-CNN) combined with a transformer, is one example of a landmark-based recognizer [7]. Pose-only models have also been applied to continuous sign language recognition [8].</w:t>
+        <w:t>Recent research is therefore moving toward gloss-free and self-supervised models. SignDino, for example, learns sign representations from video without any gloss or text labels [4]. Gan et al. similarly learn sign features without text supervision and use them for gloss-free translation [5]. A parallel trend is lightweight models that work on body and hand landmarks rather than on full video frames, which makes them small and fast enough for embedded hardware. MediaPipe is a widely used framework for extracting such landmarks [6]. The winning solution of the Google – Isolated Sign Language Recognition competition on Kaggle, a one-dimensional convolutional neural network (1D-CNN) combined with a transformer, is one example of a landmark-based recognizer [7]. Pose-only models have also been applied to continuous sign language recognition [8].</w:t>
       </w:r>
     </w:p>
     <w:p>
@@ -2389,14 +1552,7 @@
           <w:sz w:val="24"/>
           <w:szCs w:val="24"/>
         </w:rPr>
-        <w:t>Deaf ASL users often cannot get an interpreter when they need one. In a recent survey of 32 U.S. Deaf and hard-of-hearing ASL users, participants most often wanted an interpreter but could not get one in medical settings, followed by professional and educational settings [1]. These are exactly the settings where interpreting is legally mandated, which shows that the problem is not only one of law but of availability [1]. Interpreters are costly, often must be booked in advance, and can take hours to arrive,</w:t>
-      </w:r>
-      <w:r>
-        <w:rPr>
-          <w:sz w:val="24"/>
-          <w:szCs w:val="24"/>
-        </w:rPr>
-        <w:t xml:space="preserve"> especially in rural areas or at short notice [1].</w:t>
+        <w:t xml:space="preserve">Deaf ASL users often cannot get an interpreter when they need one. In a recent survey of 32 U.S. Deaf and hard-of-hearing ASL users, participants most often wanted an interpreter but could not get one in medical settings, followed by professional and educational settings [1]. These are exactly the settings where interpreting is legally mandated, which shows that the problem is not only one of law but of availability [1]. Interpreters are costly, often must be booked in advance, and can take hours to arrive, especially in rural areas or at short notice [1].</w:t>
       </w:r>
     </w:p>
     <w:p>
@@ -2424,14 +1580,7 @@
           <w:sz w:val="24"/>
           <w:szCs w:val="24"/>
         </w:rPr>
-        <w:t>Our device addresses each of these weaknesses. All processing runs locally on an embedded GPU, so the device works without a network connection and no video leaves it. A built-in microphone converts the hearing person's speech to on-screen text, so a single device supports a two-way conversation. The device speaks a sentence only after the user confirms it on screen, and when its confidence is low it shows a list of candidate signs instead of guessing. The device is intended to provide access when an interp</w:t>
-      </w:r>
-      <w:r>
-        <w:rPr>
-          <w:sz w:val="24"/>
-          <w:szCs w:val="24"/>
-        </w:rPr>
-        <w:t>reter is unavailable, such as at a service counter, a front desk, or while waiting for an interpreter to arrive. It is not a replacement for certified interpreters.</w:t>
+        <w:t>Our device addresses each of these weaknesses. All processing runs locally on an embedded GPU, so the device works without a network connection and no video leaves it. A built-in microphone converts the hearing person's speech to on-screen text, so a single device supports a two-way conversation. The device speaks a sentence only after the user confirms it on screen, and when its confidence is low it shows a list of candidate signs instead of guessing. The device is intended to provide access when an interpreter is unavailable, such as at a service counter, a front desk, or while waiting for an interpreter to arrive. It is not a replacement for certified interpreters.</w:t>
       </w:r>
     </w:p>
     <w:p>
@@ -2459,29 +1608,9 @@
           <w:sz w:val="24"/>
           <w:szCs w:val="24"/>
         </w:rPr>
-        <w:t>The objective of this project is to design and build a portable prototype that lets a Deaf ASL user hold a short two-way conversation with a hearing person who speaks English, Turkish or Spanish, without an internet connection. The prototype is scoped to structured, everyday exchanges such as those at a service counter or front desk. Its technical goals, summarized in Table 1, are to recognize a vocabulary of 100–250 ASL signs at no less than 75% top-1 and 90% top-5</w:t>
-      </w:r>
-      <w:r>
-        <w:rPr>
-          <w:sz w:val="24"/>
-          <w:szCs w:val="24"/>
-        </w:rPr>
-        <w:t xml:space="preserve"> accuracy on signers not seen during training; to speak a confirmed sentence in the selected language within 1.2 s of the user's confirmation; to show the hearing person's spoken reply as English text; and to run entirely on an embedded GPU. The project also has a reliability objective: the device should abstain rather than voice a translation it is not confident in, and we will report </w:t>
-      </w:r>
-      <w:r>
-        <w:rPr>
-          <w:sz w:val="24"/>
-          <w:szCs w:val="24"/>
-        </w:rPr>
+        <w:t xml:space="preserve">The objective of this project is to design and build a portable prototype that lets a Deaf ASL user hold a short two-way conversation with a hearing person who speaks English, Turkish or Spanish, without an internet connection. The prototype is scoped to structured, everyday exchanges such as those at a service counter or front desk. Its technical goals, summarized in Table 1, are to recognize a vocabulary of 100–250 ASL signs at no less than 75% top-1 and 90% top-5 accuracy on signers not seen during training; to speak a confirmed sentence in the selected language within 1.2 s of the user's confirmation; to show the hearing person's spoken reply as English text; and to run entirely on an embedded GPU. The project also has a reliability objective: the device should abstain rather than voice a translation it is not confident in, and we will report </w:t>
         <w:lastRenderedPageBreak/>
-        <w:t>its accuracy on the sentences it does speak</w:t>
-      </w:r>
-      <w:r>
-        <w:rPr>
-          <w:sz w:val="24"/>
-          <w:szCs w:val="24"/>
-        </w:rPr>
-        <w:t>, not only its overall accuracy. These figures are design targets; measured results will be reported as the project progresses.</w:t>
+        <w:t>its accuracy on the sentences it does speak, not only its overall accuracy. These figures are design targets; measured results will be reported as the project progresses.</w:t>
       </w:r>
     </w:p>
     <w:p>
@@ -2495,21 +1624,7 @@
           <w:sz w:val="24"/>
           <w:szCs w:val="24"/>
         </w:rPr>
-        <w:t>We chose the service-counter setting based on Deaf users' own priorities. Fig. 1 summarizes the survey ratings by setting. “Going into a business” received the highest willingness to use automatic translation, and every participant showed at least some willingness there; self-service kiosks and informal educational activities followed, while mental healthcare, education settings and formal personal events ranked lowest (Fig. 1(b)) [1]. Business settings also show a moderate unmet need for interpreters (Fig.</w:t>
-      </w:r>
-      <w:r>
-        <w:rPr>
-          <w:sz w:val="24"/>
-          <w:szCs w:val="24"/>
-        </w:rPr>
-        <w:t xml:space="preserve"> 1(a)), so a device there would fill a real gap where users are most open to </w:t>
-      </w:r>
-      <w:r>
-        <w:rPr>
-          <w:sz w:val="24"/>
-          <w:szCs w:val="24"/>
-        </w:rPr>
-        <w:t>the technology. Participants also held their lowest accuracy expectations for kiosk-type exchanges and their highest for medical settings [1]. A service counter is therefore a realistic first target for a system with a vocabulary of a few hundred signs.</w:t>
+        <w:t xml:space="preserve">We chose the service-counter setting based on Deaf users' own priorities. Fig. 1 summarizes the survey ratings by setting. “Going into a business” received the highest willingness to use automatic translation, and every participant showed at least some willingness there; self-service kiosks and informal educational activities followed, while mental healthcare, education settings and formal personal events ranked lowest (Fig. 1(b)) [1]. Business settings also show a moderate unmet need for interpreters (Fig. 1(a)), so a device there would fill a real gap where users are most open to the technology. Participants also held their lowest accuracy expectations for kiosk-type exchanges and their highest for medical settings [1]. A service counter is therefore a realistic first target for a system with a vocabulary of a few hundred signs.</w:t>
       </w:r>
     </w:p>
     <w:p>
@@ -3290,21 +2405,7 @@
           <w:sz w:val="24"/>
           <w:szCs w:val="24"/>
         </w:rPr>
-        <w:t>Fig. 2 shows how the device is used at a service counter. A single red-green-blue (RGB) camera and the touchscreen face the Deaf user, while the speaker and microphone face the hearing staff member. Body, hand and face landmarks are extracted from each camera frame with MediaPipe [6]. In natural signing, signs flow into each other with minimal pauses, and</w:t>
-      </w:r>
-      <w:r>
-        <w:rPr>
-          <w:sz w:val="24"/>
-          <w:szCs w:val="24"/>
-        </w:rPr>
-        <w:t xml:space="preserve"> segmenting them automatically is still an open research problem [9]. The user therefore signs one sign at a time and returns the hands to a rest position between signs, and the device uses this rest pose to mark where each sign ends. A lightweight landmark-based model classifies each sign and outputs its five most likely labels with confidence scores; its design follows the winning Kaggle solution [7]. The model will be trained on the ASL Citizen dataset and evaluated on its signer-independent test split, </w:t>
-      </w:r>
-      <w:r>
-        <w:rPr>
-          <w:sz w:val="24"/>
-          <w:szCs w:val="24"/>
-        </w:rPr>
-        <w:t>as well as on recordings from our own test users [2]. Words outside the vocabulary, such as names, will be handled by a fingerspelling fallback that recognizes letters one at a time.</w:t>
+        <w:t xml:space="preserve">Fig. 2 shows how the device is used at a service counter. A single red-green-blue (RGB) camera and the touchscreen face the Deaf user, while the speaker and microphone face the hearing staff member. Body, hand and face landmarks are extracted from each camera frame with MediaPipe [6]. In natural signing, signs flow into each other with minimal pauses, and segmenting them automatically is still an open research problem [9]. The user therefore signs one sign at a time and returns the hands to a rest position between signs, and the device uses this rest pose to mark where each sign ends. A lightweight landmark-based model classifies each sign and outputs its five most likely labels with confidence scores; its design follows the winning Kaggle solution [7]. The model will be trained on the ASL Citizen dataset and evaluated on its signer-independent test split, as well as on recordings from our own test users [2]. Words outside the vocabulary, such as names, will be handled by a fingerspelling fallback that recognizes letters one at a time.</w:t>
       </w:r>
     </w:p>
     <w:p>
@@ -3386,21 +2487,7 @@
           <w:sz w:val="24"/>
           <w:szCs w:val="24"/>
         </w:rPr>
-        <w:t>The recognized signs are ASL glosses, not English. ASL has its own word order and grammar, so a sequence such as STORE ME GO must become “I am going to the store.” A sentence builder performs this step, using templates for common phrases in the target setting and a small language model as a fallback, in line with recent work that applies pretrained language models to gloss-to-text translation [10]. The English sentence is shown on the touchscreen for the user to confirm or edit. Only confirmed sentences are</w:t>
-      </w:r>
-      <w:r>
-        <w:rPr>
-          <w:sz w:val="24"/>
-          <w:szCs w:val="24"/>
-        </w:rPr>
-        <w:t xml:space="preserve"> translated into Turkish or Spanish with the No Language Left Behind (NLLB-200) translation model [11]. They are then spoken by Piper, an offline neural text-to-speech system [12]. In the reverse direction, a voice-activity detector starts listening when the hearing person speaks, and the microphone is muted while the device itself is speaking so that it does not transcribe its own voice. The reply is then transcribed and translated into English by the Whisper speech recognition model [13]. The text appears</w:t>
-      </w:r>
-      <w:r>
-        <w:rPr>
-          <w:sz w:val="24"/>
-          <w:szCs w:val="24"/>
-        </w:rPr>
-        <w:t xml:space="preserve"> on the same touchscreen, so the hearing person needs no screen: they hear the device's speaker and speak into its microphone.</w:t>
+        <w:t xml:space="preserve">The recognized signs are ASL glosses, not English. ASL has its own word order and grammar, so a sequence such as STORE ME GO must become “I am going to the store.” A sentence builder performs this step, using templates for common phrases in the target setting and a small language model as a fallback, in line with recent work that applies pretrained language models to gloss-to-text translation [10]. The English sentence is shown on the touchscreen for the user to confirm or edit. Only confirmed sentences are translated into Turkish or Spanish with the No Language Left Behind (NLLB-200) translation model [11]. They are then spoken by Piper, an offline neural text-to-speech system [12]. In the reverse direction, a voice-activity detector starts listening when the hearing person speaks, and the microphone is muted while the device itself is speaking so that it does not transcribe its own voice. The reply is then transcribed and translated into English by the Whisper speech recognition model [13]. The text appears on the same touchscreen, so the hearing person needs no screen: they hear the device's speaker and speak into its microphone.</w:t>
       </w:r>
     </w:p>
     <w:p>
@@ -3415,21 +2502,8 @@
           <w:szCs w:val="24"/>
         </w:rPr>
         <w:t xml:space="preserve">The device decides when to speak using the recognizer's confidence. If the confidence for a sign is above a threshold, the top sign is accepted; otherwise the touchscreen shows the five most likely candidates and the user picks one or signs again. Nothing is spoken until the user confirms the complete English sentence. This follows the idea of selective prediction, in which a model may </w:t>
-      </w:r>
-      <w:r>
-        <w:rPr>
-          <w:sz w:val="24"/>
-          <w:szCs w:val="24"/>
-        </w:rPr>
         <w:lastRenderedPageBreak/>
-        <w:t>abstain on</w:t>
-      </w:r>
-      <w:r>
-        <w:rPr>
-          <w:sz w:val="24"/>
-          <w:szCs w:val="24"/>
-        </w:rPr>
-        <w:t xml:space="preserve"> uncertain inputs to raise accuracy on the answers it does give [14]. We will evaluate this trade-off with risk–coverage curves and report accuracy separately for each test signer.</w:t>
+        <w:t xml:space="preserve">abstain on uncertain inputs to raise accuracy on the answers it does give [14]. We will evaluate this trade-off with risk–coverage curves and report accuracy separately for each test signer.</w:t>
       </w:r>
     </w:p>
     <w:p>
@@ -3457,21 +2531,7 @@
           <w:sz w:val="24"/>
           <w:szCs w:val="24"/>
         </w:rPr>
-        <w:t xml:space="preserve">Three trends shape the field. First, research is moving from gloss-based pipelines toward gloss-free and self-supervised models that learn from large amounts of unlabeled video [4], [5]. Pretrained language models are also increasingly used for the language side of translation [10]. Second, models are moving onto consumer and embedded hardware. Landmark-based recognizers are small enough to run in real time on phones and single-board computers, which makes offline, privacy-preserving devices practical [6], </w:t>
-      </w:r>
-      <w:r>
-        <w:rPr>
-          <w:sz w:val="24"/>
-          <w:szCs w:val="24"/>
-        </w:rPr>
-        <w:t>[7]. Third, the field increasingly recognizes that sign language technology must be designed with Deaf communities rather than for them. Researchers have called for systems built around specific, real-world use cases with input from Deaf culture and linguistics experts [15]. Deaf and hard-of-hearing participants in recent studies also emphasize Deaf-led design and warn of harm when they are excluded from decisions [16]. Our project follows the second and third trends directly; it does not attempt gloss-free</w:t>
-      </w:r>
-      <w:r>
-        <w:rPr>
-          <w:sz w:val="24"/>
-          <w:szCs w:val="24"/>
-        </w:rPr>
-        <w:t xml:space="preserve"> continuous translation, which still requires large models and datasets.</w:t>
+        <w:t xml:space="preserve">Three trends shape the field. First, research is moving from gloss-based pipelines toward gloss-free and self-supervised models that learn from large amounts of unlabeled video [4], [5]. Pretrained language models are also increasingly used for the language side of translation [10]. Second, models are moving onto consumer and embedded hardware. Landmark-based recognizers are small enough to run in real time on phones and single-board computers, which makes offline, privacy-preserving devices practical [6], [7]. Third, the field increasingly recognizes that sign language technology must be designed with Deaf communities rather than for them. Researchers have called for systems built around specific, real-world use cases with input from Deaf culture and linguistics experts [15]. Deaf and hard-of-hearing participants in recent studies also emphasize Deaf-led design and warn of harm when they are excluded from decisions [16]. Our project follows the second and third trends directly; it does not attempt gloss-free continuous translation, which still requires large models and datasets.</w:t>
       </w:r>
     </w:p>
     <w:p>
@@ -3499,28 +2559,7 @@
           <w:sz w:val="24"/>
           <w:szCs w:val="24"/>
         </w:rPr>
-        <w:t xml:space="preserve">No automatic ASL translation system is yet reliable enough for general use [1]. The best-known commercial effort, SignAll, combines multiple cameras with natural language processing to translate ASL into English text [17]. Patents show several other approaches, summarized in Table 2. Avodah's system uses multiple cameras with a depth sensor [18]. Sign-Speak's system recognizes signs from a single camera using cloud processing [19]. Bosch's system uses gloves with motion sensors [20], and an earlier Hitachi </w:t>
-      </w:r>
-      <w:r>
-        <w:rPr>
-          <w:sz w:val="24"/>
-          <w:szCs w:val="24"/>
-        </w:rPr>
-        <w:t>system uses data gloves or a camera with speech output [21]. The closest to our design is Sign-Speak's system, which also works from a single camera and, in one embodiment, lets the user choose among the three most likely translations [19]. As Fig. 3 shows, however, its recognition runs on a remote server, so it needs a network connection and sends the user's data off the device [19]. Our device differs from all four in combining single-camera input, fully offline processing on an embedded GPU, confidence-g</w:t>
-      </w:r>
-      <w:r>
-        <w:rPr>
-          <w:sz w:val="24"/>
-          <w:szCs w:val="24"/>
-        </w:rPr>
-        <w:t xml:space="preserve">ated output and speech in several languages. It is also a form factor the Deaf community is open </w:t>
-      </w:r>
-      <w:r>
-        <w:rPr>
-          <w:sz w:val="24"/>
-          <w:szCs w:val="24"/>
-        </w:rPr>
-        <w:t>to: 69% of the survey participants were comfortable using a stand-alone system of this kind, compared with 38% for wearables [1].</w:t>
+        <w:t xml:space="preserve">No automatic ASL translation system is yet reliable enough for general use [1]. The best-known commercial effort, SignAll, combines multiple cameras with natural language processing to translate ASL into English text [17]. Patents show several other approaches, summarized in Table 2. Avodah's system uses multiple cameras with a depth sensor [18]. Sign-Speak's system recognizes signs from a single camera using cloud processing [19]. Bosch's system uses gloves with motion sensors [20], and an earlier Hitachi system uses data gloves or a camera with speech output [21]. The closest to our design is Sign-Speak's system, which also works from a single camera and, in one embodiment, lets the user choose among the three most likely translations [19]. As Fig. 3 shows, however, its recognition runs on a remote server, so it needs a network connection and sends the user's data off the device [19]. Our device differs from all four in combining single-camera input, fully offline processing on an embedded GPU, confidence-gated output and speech in several languages. It is also a form factor the Deaf community is open to: 69% of the survey participants were comfortable using a stand-alone system of this kind, compared with 38% for wearables [1].</w:t>
       </w:r>
     </w:p>
     <w:p>
@@ -4298,28 +3337,8 @@
           <w:szCs w:val="24"/>
         </w:rPr>
         <w:t xml:space="preserve">Surveys of Deaf communities also identify the ethical risks of this technology. More than 80% of the participants in the U.S. survey were concerned about hearing people profiting from ASL, systems missing ASL grammatical features, automatic translation weakening the legal right to other accommodations, and poorer performance for some users than others [1]. A 2025 global </w:t>
-      </w:r>
-      <w:r>
-        <w:rPr>
-          <w:sz w:val="24"/>
-          <w:szCs w:val="24"/>
-        </w:rPr>
         <w:lastRenderedPageBreak/>
-        <w:t>survey found the same pattern: about 80% of Deaf respondents were concerned about hearing people making money from sign language technology, and about 70% about the lack of Deaf people leading or contributing to it (Fig. 4) [16]. We address these concerns directly. The device is presented as a way to</w:t>
-      </w:r>
-      <w:r>
-        <w:rPr>
-          <w:sz w:val="24"/>
-          <w:szCs w:val="24"/>
-        </w:rPr>
-        <w:t xml:space="preserve"> communicate when an interpreter is unavailable, not as a substitute that could justify withholding one. Its limits are stated plainly: it recognizes individual signs and does not capture facial grammar or continuous signing. Accuracy will be reported for each test signer, not only as an average. We will seek input from Deaf ASL users when choosing the vocabulary and testing the device, as recommended by previous studies [15], [16]. Because video never leaves the device, the design also avoids the privacy r</w:t>
-      </w:r>
-      <w:r>
-        <w:rPr>
-          <w:sz w:val="24"/>
-          <w:szCs w:val="24"/>
-        </w:rPr>
-        <w:t>isk of streaming a user's image to a remote server.</w:t>
+        <w:t xml:space="preserve">survey found the same pattern: about 80% of Deaf respondents were concerned about hearing people making money from sign language technology, and about 70% about the lack of Deaf people leading or contributing to it (Fig. 4) [16]. We address these concerns directly. The device is presented as a way to communicate when an interpreter is unavailable, not as a substitute that could justify withholding one. Its limits are stated plainly: it recognizes individual signs and does not capture facial grammar or continuous signing. Accuracy will be reported for each test signer, not only as an average. We will seek input from Deaf ASL users when choosing the vocabulary and testing the device, as recommended by previous studies [15], [16]. Because video never leaves the device, the design also avoids the privacy risk of streaming a user's image to a remote server.</w:t>
       </w:r>
     </w:p>
     <w:p>
@@ -4400,14 +3419,7 @@
           <w:sz w:val="24"/>
           <w:szCs w:val="24"/>
         </w:rPr>
-        <w:t>Economically, certified interpreters are costly and often must be scheduled in advance [1]. Our device is built from off-the-shelf components (an embedded GPU module, a camera, a microphone, a speaker and a display) and uses open-source models, so once built it has no per-use service fees or cloud costs. A detailed cost estimate is given in Section 9. For sustainability, the device runs on a low-power embedded module rather than a desktop GPU or cloud servers, which keeps energy use low and avoids continuou</w:t>
-      </w:r>
-      <w:r>
-        <w:rPr>
-          <w:sz w:val="24"/>
-          <w:szCs w:val="24"/>
-        </w:rPr>
-        <w:t>s data transmission. Standard, replaceable components make the device repairable and upgradable, and the software can be moved to newer hardware instead of the device being discarded.</w:t>
+        <w:t>Economically, certified interpreters are costly and often must be scheduled in advance [1]. Our device is built from off-the-shelf components (an embedded GPU module, a camera, a microphone, a speaker and a display) and uses open-source models, so once built it has no per-use service fees or cloud costs. A detailed cost estimate is given in Section 9. For sustainability, the device runs on a low-power embedded module rather than a desktop GPU or cloud servers, which keeps energy use low and avoids continuous data transmission. Standard, replaceable components make the device repairable and upgradable, and the software can be moved to newer hardware instead of the device being discarded.</w:t>
       </w:r>
     </w:p>
     <w:p>
@@ -4434,12 +3446,6 @@
           <w:szCs w:val="24"/>
         </w:rPr>
         <w:t xml:space="preserve">This section defines the three major technical goals of the project. Each goal corresponds to one part of the system shown in Fig. 2 and has measurable targets, so that the prototype can be validated objectively during ECE 416. The goals build on each other: Goal 1 produces recognized </w:t>
-      </w:r>
-      <w:r>
-        <w:rPr>
-          <w:sz w:val="24"/>
-          <w:szCs w:val="24"/>
-        </w:rPr>
         <w:lastRenderedPageBreak/>
         <w:t>signs, Goal 2 turns them into a confirmed spoken sentence and carries the reply back, and Goal 3 makes the complete system run on portable hardware without a network connection. Table 3 summarizes the targets and how each will be verified, and Table 4 lists the team members responsible for each goal.</w:t>
       </w:r>
@@ -4481,14 +3487,7 @@
           <w:sz w:val="24"/>
           <w:szCs w:val="24"/>
         </w:rPr>
-        <w:t>Recognition works on body and hand landmarks rather than raw video, which keeps the model small enough for the embedded hardware. MediaPipe extracts the landmarks from each frame [6], and the user returns the hands to a rest position between signs so that the device can tell where each sign ends. A lightweight landmark-based classifier, following the design of the winning Kaggle solution [7], will be trained on the ASL Citizen dataset [2] and outputs the five most likely signs with a confidence score for ea</w:t>
-      </w:r>
-      <w:r>
-        <w:rPr>
-          <w:sz w:val="24"/>
-          <w:szCs w:val="24"/>
-        </w:rPr>
-        <w:t>ch.</w:t>
+        <w:t>Recognition works on body and hand landmarks rather than raw video, which keeps the model small enough for the embedded hardware. MediaPipe extracts the landmarks from each frame [6], and the user returns the hands to a rest position between signs so that the device can tell where each sign ends. A lightweight landmark-based classifier, following the design of the winning Kaggle solution [7], will be trained on the ASL Citizen dataset [2] and outputs the five most likely signs with a confidence score for each.</w:t>
       </w:r>
     </w:p>
     <w:p>
@@ -4502,21 +3501,7 @@
           <w:sz w:val="24"/>
           <w:szCs w:val="24"/>
         </w:rPr>
-        <w:t xml:space="preserve">The confidence scores are as important as the predictions themselves, because the device uses them to decide whether to accept a sign or to ask the user. A calibration step will adjust the scores so that, for example, signs reported with 90% confidence are correct about 90% of the time. The targets are at least 75% top-1 and 90% top-5 accuracy on signers not seen during training, measured on the ASL Citizen signer-independent test split and on recordings from our own test users. In addition, we will report </w:t>
-      </w:r>
-      <w:r>
-        <w:rPr>
-          <w:sz w:val="24"/>
-          <w:szCs w:val="24"/>
-        </w:rPr>
-        <w:t>the accuracy on the signs the device accepts together with the share of signs it accepts, using risk–coverage analysis [14]. Accuracy will be reported separately for each test signer, so that any signer for whom the system performs poorly is visible rather than hidden in an average. The fingerspelling fallback described in Section 3.4, which handles words outside the vocabulary such as names by recognizing letters one at a time, is treated as a stretch goal: it will be added once the main vocabulary meets t</w:t>
-      </w:r>
-      <w:r>
-        <w:rPr>
-          <w:sz w:val="24"/>
-          <w:szCs w:val="24"/>
-        </w:rPr>
-        <w:t>he targets above, and it is not part of the accuracy targets.</w:t>
+        <w:t xml:space="preserve">The confidence scores are as important as the predictions themselves, because the device uses them to decide whether to accept a sign or to ask the user. A calibration step will adjust the scores so that, for example, signs reported with 90% confidence are correct about 90% of the time. The targets are at least 75% top-1 and 90% top-5 accuracy on signers not seen during training, measured on the ASL Citizen signer-independent test split and on recordings from our own test users. In addition, we will report the accuracy on the signs the device accepts together with the share of signs it accepts, using risk–coverage analysis [14]. Accuracy will be reported separately for each test signer, so that any signer for whom the system performs poorly is visible rather than hidden in an average. The fingerspelling fallback described in Section 3.4, which handles words outside the vocabulary such as names by recognizing letters one at a time, is treated as a stretch goal: it will be added once the main vocabulary meets the targets above, and it is not part of the accuracy targets.</w:t>
       </w:r>
     </w:p>
     <w:p>
@@ -4557,14 +3542,7 @@
           <w:sz w:val="24"/>
           <w:szCs w:val="24"/>
         </w:rPr>
-        <w:t>The English sentence is shown on the touchscreen, where the user can confirm it, replace a word with another candidate, delete a word, or sign again. Only a confirmed sentence is passed on. If Turkish or Spanish is selected, the sentence is translated with NLLB-200 [11]; if English is selected, translation is skipped. Piper then speaks the sentence with a voice for the selected language [12]. In the reverse direction, a voice-activity detector starts recording when the hearing person speaks, and the microph</w:t>
-      </w:r>
-      <w:r>
-        <w:rPr>
-          <w:sz w:val="24"/>
-          <w:szCs w:val="24"/>
-        </w:rPr>
-        <w:t>one is muted while the device is speaking. Whisper transcribes the reply and translates it into English [13], using the selected language as a hint to improve accuracy, and the text is shown on the touchscreen.</w:t>
+        <w:t>The English sentence is shown on the touchscreen, where the user can confirm it, replace a word with another candidate, delete a word, or sign again. Only a confirmed sentence is passed on. If Turkish or Spanish is selected, the sentence is translated with NLLB-200 [11]; if English is selected, translation is skipped. Piper then speaks the sentence with a voice for the selected language [12]. In the reverse direction, a voice-activity detector starts recording when the hearing person speaks, and the microphone is muted while the device is speaking. Whisper transcribes the reply and translates it into English [13], using the selected language as a hint to improve accuracy, and the text is shown on the touchscreen.</w:t>
       </w:r>
     </w:p>
     <w:p>
@@ -4618,20 +3596,7 @@
           <w:sz w:val="24"/>
           <w:szCs w:val="24"/>
         </w:rPr>
-        <w:t>Running several neural networks at the same time on an embedded module is the main engineering challenge of the project. The landmark extractor, sign recognizer, sentence builder, translation model, text-to-speech system and speech recognizer all share the module's 8 GB of memory and its graphics processor. The models will therefore be converted to optimized runtimes such as ONNX Runtime or TensorRT, and the smallest model size that meets the accuracy targets will be chosen for each component. The targets a</w:t>
-      </w:r>
-      <w:r>
-        <w:rPr>
-          <w:sz w:val="24"/>
-          <w:szCs w:val="24"/>
-        </w:rPr>
-        <w:t xml:space="preserve">re landmark extraction and recognition at no less </w:t>
-      </w:r>
-      <w:r>
-        <w:rPr>
-          <w:sz w:val="24"/>
-          <w:szCs w:val="24"/>
-        </w:rPr>
+        <w:t xml:space="preserve">Running several neural networks at the same time on an embedded module is the main engineering challenge of the project. The landmark extractor, sign recognizer, sentence builder, translation model, text-to-speech system and speech recognizer all share the module's 8 GB of memory and its graphics processor. The models will therefore be converted to optimized runtimes such as ONNX Runtime or TensorRT, and the smallest model size that meets the accuracy targets will be chosen for each component. The targets are landmark extraction and recognition at no less </w:t>
         <w:lastRenderedPageBreak/>
         <w:t>than 15 frames per second during live use, all models fitting within the available memory, and a complete conversation working with networking disabled. We will also measure the device's power draw in watts, both idle and in use, to choose between battery and wall power.</w:t>
       </w:r>
@@ -4659,14 +3624,7 @@
           <w:sz w:val="24"/>
           <w:szCs w:val="24"/>
         </w:rPr>
-        <w:t>Each technical goal has a responsible team member, listed in Table 4. Goal 2 has the most separate components, from the sentence builder and touchscreen interface to translation, text-to-speech and speech recognition, so it is shared by two members. Tasks that span the whole project, including the schedule, reports, presentations and testing with Deaf ASL users, are shared by the entire team, and members will support each other at integration points such as the interface between the recognizer and the sente</w:t>
-      </w:r>
-      <w:r>
-        <w:rPr>
-          <w:sz w:val="24"/>
-          <w:szCs w:val="24"/>
-        </w:rPr>
-        <w:t>nce builder.</w:t>
+        <w:t>Each technical goal has a responsible team member, listed in Table 4. Goal 2 has the most separate components, from the sentence builder and touchscreen interface to translation, text-to-speech and speech recognition, so it is shared by two members. Tasks that span the whole project, including the schedule, reports, presentations and testing with Deaf ASL users, are shared by the entire team, and members will support each other at integration points such as the interface between the recognizer and the sentence builder.</w:t>
       </w:r>
     </w:p>
     <w:p>
@@ -5843,14 +4801,7 @@
           <w:sz w:val="24"/>
           <w:szCs w:val="24"/>
         </w:rPr>
-        <w:t>The main beneficiaries of this project are Deaf ASL users, a group whose need for interpreters often goes unmet [1]. In everyday situations such as buying something at a store, asking a question at a bank or checking in at a front desk, a Deaf person today often has to write notes, rely on a family member to interpret, or simply leave without the information they needed. The device lets them communicate in their own language and on their own, with the hearing person hearing a spoken sentence instead of read</w:t>
-      </w:r>
-      <w:r>
-        <w:rPr>
-          <w:sz w:val="24"/>
-          <w:szCs w:val="24"/>
-        </w:rPr>
-        <w:t>ing a note. Because the user confirms every sentence before it is spoken, they stay in control of what is said on their behalf.</w:t>
+        <w:t>The main beneficiaries of this project are Deaf ASL users, a group whose need for interpreters often goes unmet [1]. In everyday situations such as buying something at a store, asking a question at a bank or checking in at a front desk, a Deaf person today often has to write notes, rely on a family member to interpret, or simply leave without the information they needed. The device lets them communicate in their own language and on their own, with the hearing person hearing a spoken sentence instead of reading a note. Because the user confirms every sentence before it is spoken, they stay in control of what is said on their behalf.</w:t>
       </w:r>
     </w:p>
     <w:p>
@@ -5878,14 +4829,7 @@
           <w:sz w:val="24"/>
           <w:szCs w:val="24"/>
         </w:rPr>
-        <w:t>Businesses and public services benefit as well. Under the Americans with Disabilities Act (ADA), businesses and nonprofits that serve the public must communicate effectively with people who have communication disabilities [22]. For long or complex conversations, a qualified interpreter remains the right solution, and the device does not replace one. For short, routine exchanges for which an interpreter is rarely available at short notice, the device gives staff a practical way to communicate. Because it run</w:t>
-      </w:r>
-      <w:r>
-        <w:rPr>
-          <w:sz w:val="24"/>
-          <w:szCs w:val="24"/>
-        </w:rPr>
-        <w:t>s offline, it can also be used in rural areas and in buildings without reliable internet access.</w:t>
+        <w:t>Businesses and public services benefit as well. Under the Americans with Disabilities Act (ADA), businesses and nonprofits that serve the public must communicate effectively with people who have communication disabilities [22]. For long or complex conversations, a qualified interpreter remains the right solution, and the device does not replace one. For short, routine exchanges for which an interpreter is rarely available at short notice, the device gives staff a practical way to communicate. Because it runs offline, it can also be used in rural areas and in buildings without reliable internet access.</w:t>
       </w:r>
     </w:p>
     <w:p>
@@ -5940,14 +4884,7 @@
           <w:sz w:val="24"/>
           <w:szCs w:val="24"/>
         </w:rPr>
-        <w:t xml:space="preserve">The first issue is the risk of replacing interpreters. In the U.S. survey, 28 of the 32 Deaf and hard-of-hearing participants (88%) were concerned that automatic translation could weaken the legal protections of their right to accommodations such as interpreters [1]. A device like ours could be misused by an organization as a cheaper substitute in situations where a qualified interpreter is required. We will therefore describe and label the device as an aid for situations where no interpreter is available, </w:t>
-      </w:r>
-      <w:r>
-        <w:rPr>
-          <w:sz w:val="24"/>
-          <w:szCs w:val="24"/>
-        </w:rPr>
-        <w:t>and state this both in its documentation and on its start screen.</w:t>
+        <w:t xml:space="preserve">The first issue is the risk of replacing interpreters. In the U.S. survey, 28 of the 32 Deaf and hard-of-hearing participants (88%) were concerned that automatic translation could weaken the legal protections of their right to accommodations such as interpreters [1]. A device like ours could be misused by an organization as a cheaper substitute in situations where a qualified interpreter is required. We will therefore describe and label the device as an aid for situations where no interpreter is available, and state this both in its documentation and on its start screen.</w:t>
       </w:r>
     </w:p>
     <w:p>
@@ -5975,14 +4912,7 @@
           <w:sz w:val="24"/>
           <w:szCs w:val="24"/>
         </w:rPr>
-        <w:t>The third issue is fairness. Sign recognition systems can work less well for some people, for example because of differences in signing style, handedness, skin tone or lighting. We will test with signers who differ in these respects, report accuracy for each signer rather than only an average, and publish any limits we find. Privacy and consent are closely related: the camera captures users' faces and bodies, so all processing stays on the device and no video or audio is stored or transmitted. We use consen</w:t>
-      </w:r>
-      <w:r>
-        <w:rPr>
-          <w:sz w:val="24"/>
-          <w:szCs w:val="24"/>
-        </w:rPr>
-        <w:t>t-based training data such as ASL Citizen [2], and any recordings we make ourselves will be collected with written consent.</w:t>
+        <w:t>The third issue is fairness. Sign recognition systems can work less well for some people, for example because of differences in signing style, handedness, skin tone or lighting. We will test with signers who differ in these respects, report accuracy for each signer rather than only an average, and publish any limits we find. Privacy and consent are closely related: the camera captures users' faces and bodies, so all processing stays on the device and no video or audio is stored or transmitted. We use consent-based training data such as ASL Citizen [2], and any recordings we make ourselves will be collected with written consent.</w:t>
       </w:r>
     </w:p>
     <w:p>
@@ -5997,14 +4927,7 @@
           <w:szCs w:val="24"/>
         </w:rPr>
         <w:lastRenderedPageBreak/>
-        <w:t>Finally, Deaf involvement is the issue that Deaf communities themselves rank highest. Both surveys cited in Section 3 show that the strongest concerns are hearing people profiting from ASL and sign language technology being built without Deaf input [1], [16]. We will therefore contact the ASL community at NJIT before choosing the vocabulary, invite Deaf signers to test the prototype, credit their contributions, and adjust the design based on their feedback. Any testing with people will follow NJIT's require</w:t>
-      </w:r>
-      <w:r>
-        <w:rPr>
-          <w:sz w:val="24"/>
-          <w:szCs w:val="24"/>
-        </w:rPr>
-        <w:t>ments for research involving human participants.</w:t>
+        <w:t>Finally, Deaf involvement is the issue that Deaf communities themselves rank highest. Both surveys cited in Section 3 show that the strongest concerns are hearing people profiting from ASL and sign language technology being built without Deaf input [1], [16]. We will therefore contact the ASL community at NJIT before choosing the vocabulary, invite Deaf signers to test the prototype, credit their contributions, and adjust the design based on their feedback. Any testing with people will follow NJIT's requirements for research involving human participants.</w:t>
       </w:r>
     </w:p>
     <w:p>
@@ -6828,14 +5751,7 @@
           <w:sz w:val="24"/>
           <w:szCs w:val="24"/>
         </w:rPr>
-        <w:t>The Deaf community's main concerns about sign language technology are being left out of its design, harm from wrong translations, and the replacement of human interpreters [1], [16]. IEEE 7000 gives us a structured way to address these concerns instead of treating them as an afterthought. We will collect values from Deaf ASL users at NJIT during vocabulary selection, write them as requirements (for example, “nothing is spoken without the user’s confirmation” and “the device never presents itself as a replac</w:t>
-      </w:r>
-      <w:r>
-        <w:rPr>
-          <w:sz w:val="24"/>
-          <w:szCs w:val="24"/>
-        </w:rPr>
-        <w:t>ement for an interpreter”), and trace each requirement to a design feature and a test. Table 5 in Section 5 is the starting point of this trace.</w:t>
+        <w:t>The Deaf community's main concerns about sign language technology are being left out of its design, harm from wrong translations, and the replacement of human interpreters [1], [16]. IEEE 7000 gives us a structured way to address these concerns instead of treating them as an afterthought. We will collect values from Deaf ASL users at NJIT during vocabulary selection, write them as requirements (for example, “nothing is spoken without the user’s confirmation” and “the device never presents itself as a replacement for an interpreter”), and trace each requirement to a design feature and a test. Table 5 in Section 5 is the starting point of this trace.</w:t>
       </w:r>
     </w:p>
     <w:p>
@@ -6905,12 +5821,6 @@
           <w:szCs w:val="24"/>
         </w:rPr>
         <w:t xml:space="preserve">The device continuously captures the user’s face, body and hands, and the hearing person’s voice, which are personal data. We will carry out a privacy impact assessment for both the device and our own test recordings. It will document that all processing stays on the device, that no video or audio is stored or transmitted during normal use, and that test </w:t>
-      </w:r>
-      <w:r>
-        <w:rPr>
-          <w:sz w:val="24"/>
-          <w:szCs w:val="24"/>
-        </w:rPr>
         <w:lastRenderedPageBreak/>
         <w:t>recordings are made only with written consent, saved as body and hand landmarks rather than video where possible, and kept in the team’s private storage.</w:t>
       </w:r>
@@ -6981,14 +5891,7 @@
           <w:sz w:val="24"/>
           <w:szCs w:val="24"/>
         </w:rPr>
-        <w:t>Our system combines a sign recognition model that we train with off-the-shelf models (MediaPipe, NLLB-200, Piper and Whisper) and purchased hardware. Following this standard, we will write a V&amp;V plan that links every target in Table 3 to a verification method, the test data and a pass criterion, and that verifies each component on its own before the end-to-end tests on the Jetson Orin Nano. Because a wrong spoken sentence can mislead the listener, the confidence threshold and the confirmation screen are tre</w:t>
-      </w:r>
-      <w:r>
-        <w:rPr>
-          <w:sz w:val="24"/>
-          <w:szCs w:val="24"/>
-        </w:rPr>
-        <w:t>ated as the highest-integrity parts of the system and are tested most thoroughly.</w:t>
+        <w:t>Our system combines a sign recognition model that we train with off-the-shelf models (MediaPipe, NLLB-200, Piper and Whisper) and purchased hardware. Following this standard, we will write a V&amp;V plan that links every target in Table 3 to a verification method, the test data and a pass criterion, and that verifies each component on its own before the end-to-end tests on the Jetson Orin Nano. Because a wrong spoken sentence can mislead the listener, the confidence threshold and the confirmation screen are treated as the highest-integrity parts of the system and are tested most thoroughly.</w:t>
       </w:r>
     </w:p>
     <w:p>
@@ -7127,14 +6030,7 @@
           <w:sz w:val="24"/>
           <w:szCs w:val="24"/>
         </w:rPr>
-        <w:t>The device is used close to people for long periods and contains a power supply, a processor module that runs hot under load, and possibly a lithium-ion battery. We will use only power supplies and batteries already certified to this standard, keep the outside of the enclosure at a safe touch temperature, provide ventilation for the Jetson module, and protect cables against strain and short circuits. We will not certify the prototype itself, but designing to this standard keeps the path to a real product op</w:t>
-      </w:r>
-      <w:r>
-        <w:rPr>
-          <w:sz w:val="24"/>
-          <w:szCs w:val="24"/>
-        </w:rPr>
-        <w:t>en.</w:t>
+        <w:t>The device is used close to people for long periods and contains a power supply, a processor module that runs hot under load, and possibly a lithium-ion battery. We will use only power supplies and batteries already certified to this standard, keep the outside of the enclosure at a safe touch temperature, provide ventilation for the Jetson module, and protect cables against strain and short circuits. We will not certify the prototype itself, but designing to this standard keeps the path to a real product open.</w:t>
       </w:r>
     </w:p>
     <w:p>
@@ -7253,21 +6149,8 @@
           <w:szCs w:val="24"/>
         </w:rPr>
         <w:t xml:space="preserve">The complete system must run on an NVIDIA Jetson Orin Nano, which has 8 GB of memory shared between the processor and the graphics processing unit (GPU). Landmark extraction, sign recognition, the sentence builder, translation (NLLB-200), speech </w:t>
-      </w:r>
-      <w:r>
-        <w:rPr>
-          <w:sz w:val="24"/>
-          <w:szCs w:val="24"/>
-        </w:rPr>
         <w:lastRenderedPageBreak/>
-        <w:t>synthesis (Piper) and speech recognition (Whisper) must all fit in this memory, which limits model size and requires reduced numerical precision and loading some models only when they are needed. The device must also meet the timing targets in Table 3: at least 15 f</w:t>
-      </w:r>
-      <w:r>
-        <w:rPr>
-          <w:sz w:val="24"/>
-          <w:szCs w:val="24"/>
-        </w:rPr>
-        <w:t>rames per second for landmark extraction and recognition, and less than 1.2 s from the user’s confirmation to the start of speech. Input comes from a single RGB camera with no depth sensor, so lighting, background, camera angle and distance all affect the landmarks. Recognition is limited to a fixed vocabulary of 100–250 signs made one at a time or a few in a row, and facial grammar is not modeled. Finally, the device must work fully offline, so no cloud services can be used for any part of the pipeline.</w:t>
+        <w:t>synthesis (Piper) and speech recognition (Whisper) must all fit in this memory, which limits model size and requires reduced numerical precision and loading some models only when they are needed. The device must also meet the timing targets in Table 3: at least 15 frames per second for landmark extraction and recognition, and less than 1.2 s from the user’s confirmation to the start of speech. Input comes from a single RGB camera with no depth sensor, so lighting, background, camera angle and distance all affect the landmarks. Recognition is limited to a fixed vocabulary of 100–250 signs made one at a time or a few in a row, and facial grammar is not modeled. Finally, the device must work fully offline, so no cloud services can be used for any part of the pipeline.</w:t>
       </w:r>
     </w:p>
     <w:p>
@@ -7290,14 +6173,7 @@
           <w:sz w:val="24"/>
           <w:szCs w:val="24"/>
         </w:rPr>
-        <w:t>The prototype has no outside funding: the four team members will split its cost equally. It therefore uses off-the-shelf parts and open-source software with no license fees. Table 6 gives the estimated hardware cost of one prototype, about $485–$640, or about $120–$160 per team member (the detailed estimate will be given in Section 9). Model training uses free or low-cost cloud GPU time (Kaggle and Google Colab), which limits how large the models and how long the training runs can be. For the device to be u</w:t>
-      </w:r>
-      <w:r>
-        <w:rPr>
-          <w:sz w:val="24"/>
-          <w:szCs w:val="24"/>
-        </w:rPr>
-        <w:t>seful to businesses and public services, its total cost must stay far below the cost of repeated interpreter services [1].</w:t>
+        <w:t>The prototype has no outside funding: the four team members will split its cost equally. It therefore uses off-the-shelf parts and open-source software with no license fees. Table 6 gives the estimated hardware cost of one prototype, about $485–$640, or about $120–$160 per team member (the detailed estimate will be given in Section 9). Model training uses free or low-cost cloud GPU time (Kaggle and Google Colab), which limits how large the models and how long the training runs can be. For the device to be useful to businesses and public services, its total cost must stay far below the cost of repeated interpreter services [1].</w:t>
       </w:r>
     </w:p>
     <w:p>
@@ -8100,28 +6976,8 @@
           <w:szCs w:val="24"/>
         </w:rPr>
         <w:t xml:space="preserve">Under the Americans with Disabilities Act (ADA), businesses and public services must communicate effectively with Deaf people, which often means providing a qualified interpreter [22]. The device must therefore never be presented as a replacement for an interpreter. The data and models we use also carry license conditions. ASL </w:t>
-      </w:r>
-      <w:r>
-        <w:rPr>
-          <w:sz w:val="24"/>
-          <w:szCs w:val="24"/>
-        </w:rPr>
         <w:lastRenderedPageBreak/>
-        <w:t>Citizen may be used only for non-commercial research, and neither the data nor anything derived from it may be redistributed; the Kaggle competition data may not be redistributed eith</w:t>
-      </w:r>
-      <w:r>
-        <w:rPr>
-          <w:sz w:val="24"/>
-          <w:szCs w:val="24"/>
-        </w:rPr>
-        <w:t>er; and the NLLB-200 translation models are released for non-commercial use only, and each Piper voice has its own license that must be checked. A commercial version would need a different translation model and newly licensed training data. Recordings of Deaf participants require written consent, and we must check with NJIT whether Institutional Review Board (IRB) approval is needed before we record them. If the device became a product, it would need Federal Communications Commission (FCC) equipment authori</w:t>
-      </w:r>
-      <w:r>
-        <w:rPr>
-          <w:sz w:val="24"/>
-          <w:szCs w:val="24"/>
-        </w:rPr>
-        <w:t>zation under Part 15 as a digital device before it could be sold, and safety certification (Section 6.1).</w:t>
+        <w:t>Citizen may be used only for non-commercial research, and neither the data nor anything derived from it may be redistributed; the Kaggle competition data may not be redistributed either; and the NLLB-200 translation models are released for non-commercial use only, and each Piper voice has its own license that must be checked. A commercial version would need a different translation model and newly licensed training data. Recordings of Deaf participants require written consent, and we must check with NJIT whether Institutional Review Board (IRB) approval is needed before we record them. If the device became a product, it would need Federal Communications Commission (FCC) equipment authorization under Part 15 as a digital device before it could be sold, and safety certification (Section 6.1).</w:t>
       </w:r>
     </w:p>
     <w:p>
@@ -8167,7 +7023,7 @@
           <w:sz w:val="24"/>
           <w:szCs w:val="24"/>
         </w:rPr>
-        <w:t>The proposal must be completed within one semester, following the ECE 414 schedule, and the device must be built and tested in ECE 416. Training runs take up to about 3 hours each on the available cloud GPUs, hardware delivery takes time, and work with Deaf participants depends on their availability and on any IRB review. These limits favor proven, existing models over new research, and require the three technical goals to be developed in parallel using the interfaces agreed between them.</w:t>
+        <w:t>The proposal must be completed within one semester, following the ECE 414 schedule, and the device must be built and tested in ECE 416. Each training run of the recognizer takes several hours on the available cloud GPUs, hardware delivery takes time, and work with Deaf participants depends on their availability and on any IRB review. These limits favor proven, existing models over new research, and require the three technical goals to be developed in parallel using the interfaces agreed between them.</w:t>
       </w:r>
     </w:p>
     <w:p>
@@ -8217,12 +7073,6 @@
           <w:szCs w:val="24"/>
         </w:rPr>
         <w:t xml:space="preserve">Each risk was rated by how likely it is to happen and how much it would affect the project. Table 7 defines the high, moderate and low levels, and Table 8 lists the main risks and uncertainties for each task, with the steps we will take to reduce them. Where possible, the ratings are based on </w:t>
-      </w:r>
-      <w:r>
-        <w:rPr>
-          <w:sz w:val="24"/>
-          <w:szCs w:val="24"/>
-        </w:rPr>
         <w:lastRenderedPageBreak/>
         <w:t>our preliminary experiments with the Google Isolated Sign Language Recognition (Kaggle) data and a laptop prototype of the recognizer.</w:t>
       </w:r>
@@ -8839,7 +7689,7 @@
               <w:keepNext/>
             </w:pPr>
             <w:r>
-              <w:t>Smaller service-counter vocabulary (on a 30-sign subset our current models already reach 81.5–84.0% top-1 and 90.5–93.0% top-5); fine-tuning on ASL Citizen; hand-shape features; abstain and ask the user to repeat when unsure</w:t>
+              <w:t>Smaller service-counter vocabulary (on a 30-sign subset our v2 and v3 models already reach 81.5–84.0% top-1 and 90.5–93.0% top-5); hand-shape features (added in v4); fine-tuning on ASL Citizen (landmarks for the 155 target signs already extracted); abstain and ask the user to repeat when unsure</w:t>
             </w:r>
           </w:p>
         </w:tc>
@@ -8888,7 +7738,7 @@
           </w:tcPr>
           <w:p>
             <w:r>
-              <w:t>Accuracy differs widely between people (46% to 79% top-1 across the three test signers for our best model); with a threshold aimed at 5% error, the weakest test signer gets about 12% error</w:t>
+              <w:t>Accuracy differs widely between people (46% to 79% top-1 across the three test signers for our best model, v4); with the v2 model on the 30-sign list and a threshold aimed at 5% error, the weakest test signer gets about 12% error</w:t>
             </w:r>
           </w:p>
         </w:tc>
@@ -9211,7 +8061,7 @@
           </w:tcPr>
           <w:p>
             <w:r>
-              <w:t>Use body-relative coordinates that do not depend on the camera’s proportions; record a test set with the device camera and fine-tune on it</w:t>
+              <w:t>Body-relative coordinates that do not depend on the camera’s proportions (added in v4); record a test set with the device camera and fine-tune on it</w:t>
             </w:r>
           </w:p>
         </w:tc>
@@ -10384,12 +9234,6 @@
           <w:szCs w:val="24"/>
         </w:rPr>
         <w:t>1.</w:t>
-      </w:r>
-      <w:r>
-        <w:rPr>
-          <w:sz w:val="24"/>
-          <w:szCs w:val="24"/>
-        </w:rPr>
         <w:tab/>
         <w:t xml:space="preserve">Tran, N., Ladner, R. E., and Bragg, D. U.S. Deaf community perspectives on automatic sign language translation. </w:t>
       </w:r>
@@ -10421,19 +9265,7 @@
           <w:szCs w:val="24"/>
         </w:rPr>
         <w:t>2.</w:t>
-      </w:r>
-      <w:r>
-        <w:rPr>
-          <w:sz w:val="24"/>
-          <w:szCs w:val="24"/>
-        </w:rPr>
         <w:tab/>
-      </w:r>
-      <w:r>
-        <w:rPr>
-          <w:sz w:val="24"/>
-          <w:szCs w:val="24"/>
-        </w:rPr>
         <w:t xml:space="preserve">Desai, A., Berger, L., Minakov, F. O., Milan, V., Singh, C., Pumphrey, K., Ladner, R. E., Daumé III, H., Lu, A. X., Caselli, N., and Bragg, D. ASL Citizen: A community-sourced dataset for advancing isolated sign language recognition. </w:t>
       </w:r>
       <w:r>
@@ -10464,12 +9296,6 @@
           <w:szCs w:val="24"/>
         </w:rPr>
         <w:t>3.</w:t>
-      </w:r>
-      <w:r>
-        <w:rPr>
-          <w:sz w:val="24"/>
-          <w:szCs w:val="24"/>
-        </w:rPr>
         <w:tab/>
         <w:t xml:space="preserve">Zhang, X., and Duh, K. Approaching sign language gloss translation as a low-resource machine translation task. </w:t>
       </w:r>
@@ -10501,12 +9327,6 @@
           <w:szCs w:val="24"/>
         </w:rPr>
         <w:t>4.</w:t>
-      </w:r>
-      <w:r>
-        <w:rPr>
-          <w:sz w:val="24"/>
-          <w:szCs w:val="24"/>
-        </w:rPr>
         <w:tab/>
         <w:t xml:space="preserve">Hu, J., He, Z., Huang, H., Li, Z., Li, Z., and Fang, Y. SignDino: Self-supervised sign language representation learning via temporal-axis self-distillation. </w:t>
       </w:r>
@@ -10538,19 +9358,7 @@
           <w:szCs w:val="24"/>
         </w:rPr>
         <w:t>5.</w:t>
-      </w:r>
-      <w:r>
-        <w:rPr>
-          <w:sz w:val="24"/>
-          <w:szCs w:val="24"/>
-        </w:rPr>
         <w:tab/>
-      </w:r>
-      <w:r>
-        <w:rPr>
-          <w:sz w:val="24"/>
-          <w:szCs w:val="24"/>
-        </w:rPr>
         <w:t xml:space="preserve">Gan, S., Liu, X., Yin, Y., Liu, N., Liu, K., Tuerdaken, D., Jiang, Z., Xie, L., Lu, S., and Wen, H. Learning effective sign features without text for gloss-free sign language translation. </w:t>
       </w:r>
       <w:r>
@@ -10581,19 +9389,7 @@
           <w:szCs w:val="24"/>
         </w:rPr>
         <w:t>6.</w:t>
-      </w:r>
-      <w:r>
-        <w:rPr>
-          <w:sz w:val="24"/>
-          <w:szCs w:val="24"/>
-        </w:rPr>
         <w:tab/>
-      </w:r>
-      <w:r>
-        <w:rPr>
-          <w:sz w:val="24"/>
-          <w:szCs w:val="24"/>
-        </w:rPr>
         <w:t xml:space="preserve">Lugaresi, C., Tang, J., Nash, H., McClanahan, C., Uboweja, E., Hays, M., Zhang, F., Chang, C.-L., Yong, M. G., Lee, J., Chang, W.-T., Hua, W., Georg, M., and Grundmann, M. MediaPipe: A framework for building perception pipelines. </w:t>
       </w:r>
       <w:r>
@@ -10624,12 +9420,6 @@
           <w:szCs w:val="24"/>
         </w:rPr>
         <w:t>7.</w:t>
-      </w:r>
-      <w:r>
-        <w:rPr>
-          <w:sz w:val="24"/>
-          <w:szCs w:val="24"/>
-        </w:rPr>
         <w:tab/>
         <w:t xml:space="preserve">Sohn, H. 1st place solution: 1DCNN combined with Transformer. </w:t>
       </w:r>
@@ -10661,12 +9451,6 @@
           <w:szCs w:val="24"/>
         </w:rPr>
         <w:t>8.</w:t>
-      </w:r>
-      <w:r>
-        <w:rPr>
-          <w:sz w:val="24"/>
-          <w:szCs w:val="24"/>
-        </w:rPr>
         <w:tab/>
         <w:t xml:space="preserve">Licciardello, R., Fargetta, G., Ortis, A., and Battiato, S. CSLRTransformer: A pose-only system for continuous sign language recognition. </w:t>
       </w:r>
@@ -10698,19 +9482,7 @@
           <w:szCs w:val="24"/>
         </w:rPr>
         <w:t>9.</w:t>
-      </w:r>
-      <w:r>
-        <w:rPr>
-          <w:sz w:val="24"/>
-          <w:szCs w:val="24"/>
-        </w:rPr>
         <w:tab/>
-      </w:r>
-      <w:r>
-        <w:rPr>
-          <w:sz w:val="24"/>
-          <w:szCs w:val="24"/>
-        </w:rPr>
         <w:t xml:space="preserve">Moryossef, A., Jiang, Z., Müller, M., Ebling, S., and Goldberg, Y. Linguistically motivated sign language segmentation. </w:t>
       </w:r>
       <w:r>
@@ -10741,12 +9513,6 @@
           <w:szCs w:val="24"/>
         </w:rPr>
         <w:t>10.</w:t>
-      </w:r>
-      <w:r>
-        <w:rPr>
-          <w:sz w:val="24"/>
-          <w:szCs w:val="24"/>
-        </w:rPr>
         <w:tab/>
         <w:t xml:space="preserve">Fayyazsanavi, P., Anastasopoulos, A., and Košecká, J. Gloss2Text: Sign language gloss translation using LLMs and semantically aware label smoothing. </w:t>
       </w:r>
@@ -10778,19 +9544,7 @@
           <w:szCs w:val="24"/>
         </w:rPr>
         <w:t>11.</w:t>
-      </w:r>
-      <w:r>
-        <w:rPr>
-          <w:sz w:val="24"/>
-          <w:szCs w:val="24"/>
-        </w:rPr>
         <w:tab/>
-      </w:r>
-      <w:r>
-        <w:rPr>
-          <w:sz w:val="24"/>
-          <w:szCs w:val="24"/>
-        </w:rPr>
         <w:t xml:space="preserve">NLLB Team, Costa-jussà, M. R., Cross, J., et al. No Language Left Behind: Scaling human-centered machine translation. </w:t>
       </w:r>
       <w:r>
@@ -10821,12 +9575,6 @@
           <w:szCs w:val="24"/>
         </w:rPr>
         <w:t>12.</w:t>
-      </w:r>
-      <w:r>
-        <w:rPr>
-          <w:sz w:val="24"/>
-          <w:szCs w:val="24"/>
-        </w:rPr>
         <w:tab/>
         <w:t xml:space="preserve">Hansen, M. Piper: A fast, local neural text to speech system. </w:t>
       </w:r>
@@ -10859,12 +9607,6 @@
         </w:rPr>
         <w:lastRenderedPageBreak/>
         <w:t>13.</w:t>
-      </w:r>
-      <w:r>
-        <w:rPr>
-          <w:sz w:val="24"/>
-          <w:szCs w:val="24"/>
-        </w:rPr>
         <w:tab/>
         <w:t xml:space="preserve">Radford, A., Kim, J. W., Xu, T., Brockman, G., McLeavey, C., and Sutskever, I. Robust speech recognition via large-scale weak supervision. </w:t>
       </w:r>
@@ -10896,12 +9638,6 @@
           <w:szCs w:val="24"/>
         </w:rPr>
         <w:t>14.</w:t>
-      </w:r>
-      <w:r>
-        <w:rPr>
-          <w:sz w:val="24"/>
-          <w:szCs w:val="24"/>
-        </w:rPr>
         <w:tab/>
         <w:t xml:space="preserve">Traub, J., Bungert, T. J., Lüth, C. T., Baumgartner, M., Maier-Hein, K. H., Maier-Hein, L., and Jaeger, P. F. Overcoming common flaws in the evaluation of selective classification systems. </w:t>
       </w:r>
@@ -10933,19 +9669,7 @@
           <w:szCs w:val="24"/>
         </w:rPr>
         <w:t>15.</w:t>
-      </w:r>
-      <w:r>
-        <w:rPr>
-          <w:sz w:val="24"/>
-          <w:szCs w:val="24"/>
-        </w:rPr>
         <w:tab/>
-      </w:r>
-      <w:r>
-        <w:rPr>
-          <w:sz w:val="24"/>
-          <w:szCs w:val="24"/>
-        </w:rPr>
         <w:t xml:space="preserve">Bragg, D., Koller, O., Bellard, M., Berke, L., Boudreault, P., Braffort, A., Caselli, N., Huenerfauth, M., Kacorri, H., Verhoef, T., Vogler, C., and Morris, M. R. Sign language recognition, generation, and translation: An interdisciplinary perspective. </w:t>
       </w:r>
       <w:r>
@@ -10976,19 +9700,7 @@
           <w:szCs w:val="24"/>
         </w:rPr>
         <w:t>16.</w:t>
-      </w:r>
-      <w:r>
-        <w:rPr>
-          <w:sz w:val="24"/>
-          <w:szCs w:val="24"/>
-        </w:rPr>
         <w:tab/>
-      </w:r>
-      <w:r>
-        <w:rPr>
-          <w:sz w:val="24"/>
-          <w:szCs w:val="24"/>
-        </w:rPr>
         <w:t xml:space="preserve">Atwell, K., Imai, S., Bragg, D., and Alikhani, M. “Nothing about us without us”: Perspectives of global Deaf and hard-of-hearing community members on sign language technologies. </w:t>
       </w:r>
       <w:r>
@@ -11019,12 +9731,6 @@
           <w:szCs w:val="24"/>
         </w:rPr>
         <w:t>17.</w:t>
-      </w:r>
-      <w:r>
-        <w:rPr>
-          <w:sz w:val="24"/>
-          <w:szCs w:val="24"/>
-        </w:rPr>
         <w:tab/>
         <w:t xml:space="preserve">SignAll Technologies. SignAll translates sign language to English automatically. </w:t>
       </w:r>
@@ -11056,19 +9762,7 @@
           <w:szCs w:val="24"/>
         </w:rPr>
         <w:t>18.</w:t>
-      </w:r>
-      <w:r>
-        <w:rPr>
-          <w:sz w:val="24"/>
-          <w:szCs w:val="24"/>
-        </w:rPr>
         <w:tab/>
-      </w:r>
-      <w:r>
-        <w:rPr>
-          <w:sz w:val="24"/>
-          <w:szCs w:val="24"/>
-        </w:rPr>
         <w:t xml:space="preserve">Menefee, M., Nash, D., and Chandler, T. Automated sign language translation and communication using multiple input and output modalities. </w:t>
       </w:r>
       <w:r>
@@ -11099,12 +9793,6 @@
           <w:szCs w:val="24"/>
         </w:rPr>
         <w:t>19.</w:t>
-      </w:r>
-      <w:r>
-        <w:rPr>
-          <w:sz w:val="24"/>
-          <w:szCs w:val="24"/>
-        </w:rPr>
         <w:tab/>
         <w:t xml:space="preserve">Kelly, N. A. Realtime AI sign language recognition. </w:t>
       </w:r>
@@ -11136,12 +9824,6 @@
           <w:szCs w:val="24"/>
         </w:rPr>
         <w:t>20.</w:t>
-      </w:r>
-      <w:r>
-        <w:rPr>
-          <w:sz w:val="24"/>
-          <w:szCs w:val="24"/>
-        </w:rPr>
         <w:tab/>
         <w:t xml:space="preserve">Zhou, Z., Menne, T., Li, K., Xu, K., Feng, Z., and Lee, C.-H. System and method for automated sign language recognition. </w:t>
       </w:r>
@@ -11173,19 +9855,7 @@
           <w:szCs w:val="24"/>
         </w:rPr>
         <w:t>21.</w:t>
-      </w:r>
-      <w:r>
-        <w:rPr>
-          <w:sz w:val="24"/>
-          <w:szCs w:val="24"/>
-        </w:rPr>
         <w:tab/>
-      </w:r>
-      <w:r>
-        <w:rPr>
-          <w:sz w:val="24"/>
-          <w:szCs w:val="24"/>
-        </w:rPr>
         <w:t xml:space="preserve">Sakou, H., Sagawa, H., Abe, M., Ichikawa, A., Inoue, K., Arai, K., Shimura, T., and Toda, Y. Sign recognition apparatus and method and sign translation system using same. </w:t>
       </w:r>
       <w:r>
@@ -11216,12 +9886,6 @@
           <w:szCs w:val="24"/>
         </w:rPr>
         <w:t>22.</w:t>
-      </w:r>
-      <w:r>
-        <w:rPr>
-          <w:sz w:val="24"/>
-          <w:szCs w:val="24"/>
-        </w:rPr>
         <w:tab/>
         <w:t xml:space="preserve">U.S. Department of Justice, Civil Rights Division. ADA requirements: Effective communication. </w:t>
       </w:r>
@@ -11253,12 +9917,6 @@
           <w:szCs w:val="24"/>
         </w:rPr>
         <w:t>23.</w:t>
-      </w:r>
-      <w:r>
-        <w:rPr>
-          <w:sz w:val="24"/>
-          <w:szCs w:val="24"/>
-        </w:rPr>
         <w:tab/>
         <w:t xml:space="preserve">IEEE. IEEE Code of Ethics. </w:t>
       </w:r>
@@ -11290,12 +9948,6 @@
           <w:szCs w:val="24"/>
         </w:rPr>
         <w:t>24.</w:t>
-      </w:r>
-      <w:r>
-        <w:rPr>
-          <w:sz w:val="24"/>
-          <w:szCs w:val="24"/>
-        </w:rPr>
         <w:tab/>
         <w:t xml:space="preserve">IEEE. IEEE Standard Model Process for Addressing Ethical Concerns during System Design. </w:t>
       </w:r>
@@ -11327,12 +9979,6 @@
           <w:szCs w:val="24"/>
         </w:rPr>
         <w:t>25.</w:t>
-      </w:r>
-      <w:r>
-        <w:rPr>
-          <w:sz w:val="24"/>
-          <w:szCs w:val="24"/>
-        </w:rPr>
         <w:tab/>
         <w:t xml:space="preserve">IEEE. IEEE Standard for Data Privacy Process. </w:t>
       </w:r>
@@ -11364,19 +10010,7 @@
           <w:szCs w:val="24"/>
         </w:rPr>
         <w:t>26.</w:t>
-      </w:r>
-      <w:r>
-        <w:rPr>
-          <w:sz w:val="24"/>
-          <w:szCs w:val="24"/>
-        </w:rPr>
         <w:tab/>
-      </w:r>
-      <w:r>
-        <w:rPr>
-          <w:sz w:val="24"/>
-          <w:szCs w:val="24"/>
-        </w:rPr>
         <w:t xml:space="preserve">IEEE. IEEE Standard for System, Software, and Hardware Verification and Validation. </w:t>
       </w:r>
       <w:r>
@@ -11393,7 +10027,7 @@
           <w:sz w:val="24"/>
           <w:szCs w:val="24"/>
         </w:rPr>
-        <w:t>, 2025.</w:t>
+        <w:t>, 2025. Available: https://standards.ieee.org/ieee/1012/7324/ [Accessed: 15-Oct-2026].</w:t>
       </w:r>
     </w:p>
     <w:p>
@@ -11408,12 +10042,6 @@
         </w:rPr>
         <w:lastRenderedPageBreak/>
         <w:t>27.</w:t>
-      </w:r>
-      <w:r>
-        <w:rPr>
-          <w:sz w:val="24"/>
-          <w:szCs w:val="24"/>
-        </w:rPr>
         <w:tab/>
         <w:t xml:space="preserve">IEEE. IEEE Recommended Practice for Framework and Process for Deep Learning Evaluation. </w:t>
       </w:r>
@@ -11445,12 +10073,6 @@
           <w:szCs w:val="24"/>
         </w:rPr>
         <w:t>28.</w:t>
-      </w:r>
-      <w:r>
-        <w:rPr>
-          <w:sz w:val="24"/>
-          <w:szCs w:val="24"/>
-        </w:rPr>
         <w:tab/>
         <w:t xml:space="preserve">UL. Audio/Video, Information and Communication Technology Equipment – Part 1: Safety Requirements. </w:t>
       </w:r>
@@ -11468,7 +10090,7 @@
           <w:sz w:val="24"/>
           <w:szCs w:val="24"/>
         </w:rPr>
-        <w:t>, 3rd ed., 2019.</w:t>
+        <w:t>, 3rd ed., 2019. Available: https://webstore.ansi.org/standards/ul/ul62368ed2019 [Accessed: 15-Oct-2026].</w:t>
       </w:r>
     </w:p>
     <w:p>
@@ -11482,19 +10104,7 @@
           <w:szCs w:val="24"/>
         </w:rPr>
         <w:t>29.</w:t>
-      </w:r>
-      <w:r>
-        <w:rPr>
-          <w:sz w:val="24"/>
-          <w:szCs w:val="24"/>
-        </w:rPr>
         <w:tab/>
-      </w:r>
-      <w:r>
-        <w:rPr>
-          <w:sz w:val="24"/>
-          <w:szCs w:val="24"/>
-        </w:rPr>
         <w:t xml:space="preserve">National Institute of Standards and Technology. Artificial Intelligence Risk Management Framework (AI RMF 1.0). </w:t>
       </w:r>
       <w:r>

</xml_diff>